<commit_message>
dandole prioridad a estadisticas especificadas en el documento entregado como primer entrega y no al codigo existente - existian diferencias y se pulieron - delimitamos cantidad de vistas a desarrollar
</commit_message>
<xml_diff>
--- a/docs/CAMBIOS-16-10.docx
+++ b/docs/CAMBIOS-16-10.docx
@@ -27,7 +27,7 @@
           <w:sz w:val="24"/>
           <w:szCs w:val="24"/>
         </w:rPr>
-        <w:t xml:space="preserve">Qué toqueteamos el 16/10/2026 (pulido post-devolución, base para la Fase B)</w:t>
+        <w:t xml:space="preserve">Qué toqueteamos el 16/10/2026: pulido post-devolución y base para la Fase B</w:t>
       </w:r>
     </w:p>
     <w:p>
@@ -43,7 +43,27 @@
         <w:spacing w:after="120"/>
       </w:pPr>
       <w:r>
-        <w:t xml:space="preserve">Che, les dejo resumido qué hice. No agregué funcionalidades grandes: la idea fue ordenar la casa para que de acá en adelante podamos codear sin pisarnos y sin que el profe nos marque lo mismo que ya nos pidió.</w:t>
+        <w:t xml:space="preserve">Che, les dejo resumido qué hice. La idea fue ordenar la casa para que de acá en adelante podamos codear sin pisarnos y sin que el profe nos marque lo mismo que ya nos pidió.</w:t>
+      </w:r>
+    </w:p>
+    <w:p>
+      <w:pPr>
+        <w:pBdr>
+          <w:left w:val="single" w:color="2E4A7A" w:sz="18" w:space="8"/>
+        </w:pBdr>
+        <w:shd w:fill="F2F4F8" w:color="auto" w:val="clear"/>
+        <w:spacing w:after="160" w:before="120"/>
+        <w:ind w:left="200"/>
+      </w:pPr>
+      <w:r>
+        <w:rPr>
+          <w:b/>
+          <w:bCs/>
+        </w:rPr>
+        <w:t xml:space="preserve">Regla que acordamos: </w:t>
+      </w:r>
+      <w:r>
+        <w:t xml:space="preserve">ante cualquier duda entre el código y el documento entregado, MANDA EL DOCUMENTO. Si queremos cambiar una regla del juego, primero se cambia el documento y después el código.</w:t>
       </w:r>
     </w:p>
     <w:p>
@@ -63,7 +83,7 @@
         <w:t xml:space="preserve">Borré </w:t>
       </w:r>
       <w:r>
-        <w:t xml:space="preserve">todo lo que quedaba del diseño viejo (Sacerdote, Cazador, Repartidores, archivos duplicados, .class compilados). Antes el proyecto ni siquiera compilaba entero por esos duplicados.</w:t>
+        <w:t xml:space="preserve">todo lo que quedaba del diseño viejo y lo que no estaba en el documento (Sacerdote, Cazador, Repartidores, archivos duplicados, Esqueleto, Revivir, Escupitajo, Golpe Debilitante, Toque de Muerte, .class compilados).</w:t>
       </w:r>
     </w:p>
     <w:p>
@@ -80,10 +100,10 @@
           <w:b/>
           <w:bCs/>
         </w:rPr>
-        <w:t xml:space="preserve">Reorganicé </w:t>
-      </w:r>
-      <w:r>
-        <w:t xml:space="preserve">el código en paquetes MVC de verdad: modelo / controlador / vista (+ una consola de prueba).</w:t>
+        <w:t xml:space="preserve">Alineé </w:t>
+      </w:r>
+      <w:r>
+        <w:t xml:space="preserve">todo el código al documento: habilidades, enemigos, stats de los jefes.</w:t>
       </w:r>
     </w:p>
     <w:p>
@@ -100,10 +120,10 @@
           <w:b/>
           <w:bCs/>
         </w:rPr>
-        <w:t xml:space="preserve">Creé </w:t>
-      </w:r>
-      <w:r>
-        <w:t xml:space="preserve">ControladorDeBatalla, Habilidad (con 4 subclases) y GeneradorDeEnemigos. MotorDeCombate desapareció: su lógica se repartió entre Batalla, Party y el controlador.</w:t>
+        <w:t xml:space="preserve">Reorganicé </w:t>
+      </w:r>
+      <w:r>
+        <w:t xml:space="preserve">el código en paquetes MVC: modelo / controlador / vista (+ una consola de prueba).</w:t>
       </w:r>
     </w:p>
     <w:p>
@@ -120,10 +140,10 @@
           <w:b/>
           <w:bCs/>
         </w:rPr>
-        <w:t xml:space="preserve">Apliqué </w:t>
-      </w:r>
-      <w:r>
-        <w:t xml:space="preserve">lo que pidió el profe: UN enemigo por batalla, party de 2 a 4, la pantalla no decide nada, diagramas que coincidan con el código.</w:t>
+        <w:t xml:space="preserve">Rehice las pantallas </w:t>
+      </w:r>
+      <w:r>
+        <w:t xml:space="preserve">según lo charlado con el profe: Menú, Partidas guardadas, Batalla, Resumen de batalla e Inventario. Se fue la pantalla de Torre.</w:t>
       </w:r>
     </w:p>
     <w:p>
@@ -140,10 +160,10 @@
           <w:b/>
           <w:bCs/>
         </w:rPr>
-        <w:t xml:space="preserve">Arreglé </w:t>
-      </w:r>
-      <w:r>
-        <w:t xml:space="preserve">6 bugs (Defender eterno, Revivir que no podía revivir, maná que no se reseteaba, etc.).</w:t>
+        <w:t xml:space="preserve">Creé </w:t>
+      </w:r>
+      <w:r>
+        <w:t xml:space="preserve">Partida, ControladorDeJuego, ControladorDeBatalla, Habilidad (+2 subclases), GeneradorDeEnemigos y ResultadoDeBatalla. Ya se puede jugar una partida entera del piso 1 al 10.</w:t>
       </w:r>
     </w:p>
     <w:p>
@@ -160,10 +180,10 @@
           <w:b/>
           <w:bCs/>
         </w:rPr>
-        <w:t xml:space="preserve">Conecté </w:t>
-      </w:r>
-      <w:r>
-        <w:t xml:space="preserve">la pantalla de Batalla al motor real: ahora respeta el orden por Velocidad y el enemigo juega solo.</w:t>
+        <w:t xml:space="preserve">Arreglé </w:t>
+      </w:r>
+      <w:r>
+        <w:t xml:space="preserve">varios bugs (Defender eterno, maná que no se reseteaba, perder el turno por falta de maná, mensajes que no llegaban a la pantalla).</w:t>
       </w:r>
     </w:p>
     <w:p>
@@ -183,7 +203,7 @@
         <w:t xml:space="preserve">Probé </w:t>
       </w:r>
       <w:r>
-        <w:t xml:space="preserve">todo: compila, 2000 batallas simuladas sin errores, y la ventana funcionando (captura más abajo).</w:t>
+        <w:t xml:space="preserve">todo: compila, 1000 partidas completas simuladas sin errores y la ventana funcionando (capturas más abajo).</w:t>
       </w:r>
     </w:p>
     <w:p>
@@ -200,10 +220,10 @@
           <w:b/>
           <w:bCs/>
         </w:rPr>
-        <w:t xml:space="preserve">Ojo con una cosa: </w:t>
-      </w:r>
-      <w:r>
-        <w:t xml:space="preserve">en la carpeta del proyecto no había un archivo con la devolución escrita del profe. Trabajé contra los requisitos formales de la cátedra, las sugerencias del profe que ya teníamos anotadas (un enemigo por batalla, party 2-4, MVC + GRASP, diagramas consistentes con el código) y lo que entregamos en la Fase A. Si alguien tiene la devolución textual, pásenla y reviso que no se me haya escapado nada.</w:t>
+        <w:t xml:space="preserve">Ojo: </w:t>
+      </w:r>
+      <w:r>
+        <w:t xml:space="preserve">en la carpeta no había un archivo con la devolución escrita del profe. Trabajé contra los requisitos de la cátedra, las notas que teníamos de lo que pidió el profe (un enemigo por batalla, party de 2 a 4, MVC + GRASP, diagramas que coincidan con el código, las pantallas mínimas) y el documento de la Fase A.</w:t>
       </w:r>
     </w:p>
     <w:p>
@@ -244,20 +264,20 @@
           <w:b/>
           <w:bCs/>
         </w:rPr>
-        <w:t xml:space="preserve">Main.java</w:t>
-      </w:r>
-      <w:r>
-        <w:t xml:space="preserve"> (RPG/Main) abre la ventana de Swing. </w:t>
+        <w:t xml:space="preserve">RPG/Main</w:t>
+      </w:r>
+      <w:r>
+        <w:t xml:space="preserve"> abre la ventana. </w:t>
       </w:r>
       <w:r>
         <w:rPr>
           <w:b/>
           <w:bCs/>
         </w:rPr>
-        <w:t xml:space="preserve">JuegoConsola</w:t>
-      </w:r>
-      <w:r>
-        <w:t xml:space="preserve"> (RPG/consola) juega una batalla por consola.</w:t>
+        <w:t xml:space="preserve">RPG/consola/JuegoConsola</w:t>
+      </w:r>
+      <w:r>
+        <w:t xml:space="preserve"> juega una partida entera por consola.</w:t>
       </w:r>
     </w:p>
     <w:p>
@@ -270,7 +290,18 @@
         <w:spacing w:after="80"/>
       </w:pPr>
       <w:r>
-        <w:t xml:space="preserve">Si alguien lo sube a Git desde Windows: los paquetes ahora están en minúscula (vista, no Vista). Windows no distingue mayúsculas, así que conviene borrar la carpeta src vieja del repo y commitear la nueva en vez de "renombrar".</w:t>
+        <w:t xml:space="preserve">Git desde Windows: los paquetes ahora van en minúscula (vista, no Vista) y Windows no distingue mayúsculas. Hacerlo en 2 commits: primero borrar la src vieja y commitear, después pegar la nueva y commitear. Si en GitHub aparece </w:t>
+      </w:r>
+      <w:r>
+        <w:rPr>
+          <w:rFonts w:ascii="Consolas" w:cs="Consolas" w:eastAsia="Consolas" w:hAnsi="Consolas"/>
+          <w:sz w:val="19"/>
+          <w:szCs w:val="19"/>
+        </w:rPr>
+        <w:t xml:space="preserve">src/RPG/vista</w:t>
+      </w:r>
+      <w:r>
+        <w:t xml:space="preserve"> en minúscula, quedó bien.</w:t>
       </w:r>
     </w:p>
     <w:p>
@@ -294,7 +325,7 @@
         <w:t xml:space="preserve">entregales-1</w:t>
       </w:r>
       <w:r>
-        <w:t xml:space="preserve"> pasó a llamarse </w:t>
+        <w:t xml:space="preserve"> pasó a </w:t>
       </w:r>
       <w:r>
         <w:rPr>
@@ -316,7 +347,7 @@
         <w:t xml:space="preserve">out/</w:t>
       </w:r>
       <w:r>
-        <w:t xml:space="preserve"> se borró y quedó en el .gitignore: IntelliJ la regenera sola.</w:t>
+        <w:t xml:space="preserve"> se borró y quedó en el .gitignore.</w:t>
       </w:r>
     </w:p>
     <w:p>
@@ -373,7 +404,7 @@
                 <w:sz w:val="19"/>
                 <w:szCs w:val="19"/>
               </w:rPr>
-              <w:t xml:space="preserve">Archivo</w:t>
+              <w:t xml:space="preserve">Archivo / cosa</w:t>
             </w:r>
           </w:p>
         </w:tc>
@@ -461,7 +492,7 @@
                 <w:sz w:val="19"/>
                 <w:szCs w:val="19"/>
               </w:rPr>
-              <w:t xml:space="preserve">Copias del diseño viejo con el mismo nombre de clase que las nuevas: rompían la compilación.</w:t>
+              <w:t xml:space="preserve">Copias del diseño viejo con el mismo nombre de clase que las nuevas: el proyecto no compilaba.</w:t>
             </w:r>
           </w:p>
         </w:tc>
@@ -491,7 +522,7 @@
                 <w:sz w:val="19"/>
                 <w:szCs w:val="19"/>
               </w:rPr>
-              <w:t xml:space="preserve">Sacerdote.java, Cazador.java</w:t>
+              <w:t xml:space="preserve">Sacerdote, Cazador, RepartidorAtributos, RepartidorHabilidades</w:t>
             </w:r>
           </w:p>
         </w:tc>
@@ -519,7 +550,7 @@
                 <w:sz w:val="19"/>
                 <w:szCs w:val="19"/>
               </w:rPr>
-              <w:t xml:space="preserve">Reemplazados hace rato por Curador y Arquero. Usaban Fuerza/Destreza/etc. que ya no existen.</w:t>
+              <w:t xml:space="preserve">Diseño viejo (Fuerza/Destreza/etc.). Ya estaban reemplazados por Curador y Arquero.</w:t>
             </w:r>
           </w:p>
         </w:tc>
@@ -549,7 +580,7 @@
                 <w:sz w:val="19"/>
                 <w:szCs w:val="19"/>
               </w:rPr>
-              <w:t xml:space="preserve">RepartidorAtributos / RepartidorHabilidades</w:t>
+              <w:t xml:space="preserve">MotorDeCombate y el Main de pruebas</w:t>
             </w:r>
           </w:p>
         </w:tc>
@@ -577,7 +608,7 @@
                 <w:sz w:val="19"/>
                 <w:szCs w:val="19"/>
               </w:rPr>
-              <w:t xml:space="preserve">El checklist ya decía que estaban eliminados, pero seguían en la carpeta.</w:t>
+              <w:t xml:space="preserve">Mezclaban lógica con Scanner/System.out. Se repartieron en Batalla, Party, los controladores y JuegoConsola.</w:t>
             </w:r>
           </w:p>
         </w:tc>
@@ -607,7 +638,7 @@
                 <w:sz w:val="19"/>
                 <w:szCs w:val="19"/>
               </w:rPr>
-              <w:t xml:space="preserve">MotorDeCombate.java</w:t>
+              <w:t xml:space="preserve">Esqueleto + Toque de Muerte</w:t>
             </w:r>
           </w:p>
         </w:tc>
@@ -635,7 +666,7 @@
                 <w:sz w:val="19"/>
                 <w:szCs w:val="19"/>
               </w:rPr>
-              <w:t xml:space="preserve">Mezclaba lógica de batalla con Scanner y System.out. Se repartió en Batalla + Party + ControladorDeBatalla + JuegoConsola.</w:t>
+              <w:t xml:space="preserve">No está en el documento (era un enemigo de prueba).</w:t>
             </w:r>
           </w:p>
         </w:tc>
@@ -665,7 +696,7 @@
                 <w:sz w:val="19"/>
                 <w:szCs w:val="19"/>
               </w:rPr>
-              <w:t xml:space="preserve">Main.java (versión vieja de pruebas)</w:t>
+              <w:t xml:space="preserve">Revivir + inmortalidad</w:t>
             </w:r>
           </w:p>
         </w:tc>
@@ -693,7 +724,7 @@
                 <w:sz w:val="19"/>
                 <w:szCs w:val="19"/>
               </w:rPr>
-              <w:t xml:space="preserve">Era un rejunte de pruebas manuales. Ahora Main abre Swing y las pruebas por consola están en JuegoConsola.</w:t>
+              <w:t xml:space="preserve">El documento dice Sanación Mayor (cura 45). Ahora es eso.</w:t>
             </w:r>
           </w:p>
         </w:tc>
@@ -723,6 +754,238 @@
                 <w:sz w:val="19"/>
                 <w:szCs w:val="19"/>
               </w:rPr>
+              <w:t xml:space="preserve">Escupitajo (Slime) y Golpe Debilitante (Goblin)</w:t>
+            </w:r>
+          </w:p>
+        </w:tc>
+        <w:tc>
+          <w:tcPr>
+            <w:tcW w:type="dxa" w:w="5726"/>
+            <w:tcBorders>
+              <w:top w:val="single" w:color="C8CDD6" w:sz="4"/>
+              <w:left w:val="single" w:color="C8CDD6" w:sz="4"/>
+              <w:bottom w:val="single" w:color="C8CDD6" w:sz="4"/>
+              <w:right w:val="single" w:color="C8CDD6" w:sz="4"/>
+            </w:tcBorders>
+            <w:tcMar>
+              <w:top w:type="dxa" w:w="60"/>
+              <w:left w:type="dxa" w:w="100"/>
+              <w:bottom w:type="dxa" w:w="60"/>
+              <w:right w:type="dxa" w:w="100"/>
+            </w:tcMar>
+          </w:tcPr>
+          <w:p>
+            <w:r>
+              <w:rPr>
+                <w:b w:val="false"/>
+                <w:bCs w:val="false"/>
+                <w:sz w:val="19"/>
+                <w:szCs w:val="19"/>
+              </w:rPr>
+              <w:t xml:space="preserve">El documento dice "Slime: solo ataca" y "Goblin: 70% ataca / 30% aturde".</w:t>
+            </w:r>
+          </w:p>
+        </w:tc>
+      </w:tr>
+      <w:tr>
+        <w:tc>
+          <w:tcPr>
+            <w:tcW w:type="dxa" w:w="3300"/>
+            <w:tcBorders>
+              <w:top w:val="single" w:color="C8CDD6" w:sz="4"/>
+              <w:left w:val="single" w:color="C8CDD6" w:sz="4"/>
+              <w:bottom w:val="single" w:color="C8CDD6" w:sz="4"/>
+              <w:right w:val="single" w:color="C8CDD6" w:sz="4"/>
+            </w:tcBorders>
+            <w:tcMar>
+              <w:top w:type="dxa" w:w="60"/>
+              <w:left w:type="dxa" w:w="100"/>
+              <w:bottom w:type="dxa" w:w="60"/>
+              <w:right w:type="dxa" w:w="100"/>
+            </w:tcMar>
+          </w:tcPr>
+          <w:p>
+            <w:r>
+              <w:rPr>
+                <w:b w:val="false"/>
+                <w:bCs w:val="false"/>
+                <w:sz w:val="19"/>
+                <w:szCs w:val="19"/>
+              </w:rPr>
+              <w:t xml:space="preserve">Crítico del Disparo Certero</w:t>
+            </w:r>
+          </w:p>
+        </w:tc>
+        <w:tc>
+          <w:tcPr>
+            <w:tcW w:type="dxa" w:w="5726"/>
+            <w:tcBorders>
+              <w:top w:val="single" w:color="C8CDD6" w:sz="4"/>
+              <w:left w:val="single" w:color="C8CDD6" w:sz="4"/>
+              <w:bottom w:val="single" w:color="C8CDD6" w:sz="4"/>
+              <w:right w:val="single" w:color="C8CDD6" w:sz="4"/>
+            </w:tcBorders>
+            <w:tcMar>
+              <w:top w:type="dxa" w:w="60"/>
+              <w:left w:type="dxa" w:w="100"/>
+              <w:bottom w:type="dxa" w:w="60"/>
+              <w:right w:type="dxa" w:w="100"/>
+            </w:tcMar>
+          </w:tcPr>
+          <w:p>
+            <w:r>
+              <w:rPr>
+                <w:b w:val="false"/>
+                <w:bCs w:val="false"/>
+                <w:sz w:val="19"/>
+                <w:szCs w:val="19"/>
+              </w:rPr>
+              <w:t xml:space="preserve">El documento dice "daño físico x1.5".</w:t>
+            </w:r>
+          </w:p>
+        </w:tc>
+      </w:tr>
+      <w:tr>
+        <w:tc>
+          <w:tcPr>
+            <w:tcW w:type="dxa" w:w="3300"/>
+            <w:tcBorders>
+              <w:top w:val="single" w:color="C8CDD6" w:sz="4"/>
+              <w:left w:val="single" w:color="C8CDD6" w:sz="4"/>
+              <w:bottom w:val="single" w:color="C8CDD6" w:sz="4"/>
+              <w:right w:val="single" w:color="C8CDD6" w:sz="4"/>
+            </w:tcBorders>
+            <w:tcMar>
+              <w:top w:type="dxa" w:w="60"/>
+              <w:left w:type="dxa" w:w="100"/>
+              <w:bottom w:type="dxa" w:w="60"/>
+              <w:right w:type="dxa" w:w="100"/>
+            </w:tcMar>
+          </w:tcPr>
+          <w:p>
+            <w:r>
+              <w:rPr>
+                <w:b w:val="false"/>
+                <w:bCs w:val="false"/>
+                <w:sz w:val="19"/>
+                <w:szCs w:val="19"/>
+              </w:rPr>
+              <w:t xml:space="preserve">Stats rebalanceadas de los jefes</w:t>
+            </w:r>
+          </w:p>
+        </w:tc>
+        <w:tc>
+          <w:tcPr>
+            <w:tcW w:type="dxa" w:w="5726"/>
+            <w:tcBorders>
+              <w:top w:val="single" w:color="C8CDD6" w:sz="4"/>
+              <w:left w:val="single" w:color="C8CDD6" w:sz="4"/>
+              <w:bottom w:val="single" w:color="C8CDD6" w:sz="4"/>
+              <w:right w:val="single" w:color="C8CDD6" w:sz="4"/>
+            </w:tcBorders>
+            <w:tcMar>
+              <w:top w:type="dxa" w:w="60"/>
+              <w:left w:type="dxa" w:w="100"/>
+              <w:bottom w:type="dxa" w:w="60"/>
+              <w:right w:type="dxa" w:w="100"/>
+            </w:tcMar>
+          </w:tcPr>
+          <w:p>
+            <w:r>
+              <w:rPr>
+                <w:b w:val="false"/>
+                <w:bCs w:val="false"/>
+                <w:sz w:val="19"/>
+                <w:szCs w:val="19"/>
+              </w:rPr>
+              <w:t xml:space="preserve">Volvieron a los del documento (Rey Slime 70/30/20/25, Guardián 120/45/30/35).</w:t>
+            </w:r>
+          </w:p>
+        </w:tc>
+      </w:tr>
+      <w:tr>
+        <w:tc>
+          <w:tcPr>
+            <w:tcW w:type="dxa" w:w="3300"/>
+            <w:tcBorders>
+              <w:top w:val="single" w:color="C8CDD6" w:sz="4"/>
+              <w:left w:val="single" w:color="C8CDD6" w:sz="4"/>
+              <w:bottom w:val="single" w:color="C8CDD6" w:sz="4"/>
+              <w:right w:val="single" w:color="C8CDD6" w:sz="4"/>
+            </w:tcBorders>
+            <w:tcMar>
+              <w:top w:type="dxa" w:w="60"/>
+              <w:left w:type="dxa" w:w="100"/>
+              <w:bottom w:type="dxa" w:w="60"/>
+              <w:right w:type="dxa" w:w="100"/>
+            </w:tcMar>
+          </w:tcPr>
+          <w:p>
+            <w:r>
+              <w:rPr>
+                <w:b w:val="false"/>
+                <w:bCs w:val="false"/>
+                <w:sz w:val="19"/>
+                <w:szCs w:val="19"/>
+              </w:rPr>
+              <w:t xml:space="preserve">PantallaTorre</w:t>
+            </w:r>
+          </w:p>
+        </w:tc>
+        <w:tc>
+          <w:tcPr>
+            <w:tcW w:type="dxa" w:w="5726"/>
+            <w:tcBorders>
+              <w:top w:val="single" w:color="C8CDD6" w:sz="4"/>
+              <w:left w:val="single" w:color="C8CDD6" w:sz="4"/>
+              <w:bottom w:val="single" w:color="C8CDD6" w:sz="4"/>
+              <w:right w:val="single" w:color="C8CDD6" w:sz="4"/>
+            </w:tcBorders>
+            <w:tcMar>
+              <w:top w:type="dxa" w:w="60"/>
+              <w:left w:type="dxa" w:w="100"/>
+              <w:bottom w:type="dxa" w:w="60"/>
+              <w:right w:type="dxa" w:w="100"/>
+            </w:tcMar>
+          </w:tcPr>
+          <w:p>
+            <w:r>
+              <w:rPr>
+                <w:b w:val="false"/>
+                <w:bCs w:val="false"/>
+                <w:sz w:val="19"/>
+                <w:szCs w:val="19"/>
+              </w:rPr>
+              <w:t xml:space="preserve">No está en las pantallas acordadas con el profe. Ahora se sube de piso desde el Resumen.</w:t>
+            </w:r>
+          </w:p>
+        </w:tc>
+      </w:tr>
+      <w:tr>
+        <w:tc>
+          <w:tcPr>
+            <w:tcW w:type="dxa" w:w="3300"/>
+            <w:tcBorders>
+              <w:top w:val="single" w:color="C8CDD6" w:sz="4"/>
+              <w:left w:val="single" w:color="C8CDD6" w:sz="4"/>
+              <w:bottom w:val="single" w:color="C8CDD6" w:sz="4"/>
+              <w:right w:val="single" w:color="C8CDD6" w:sz="4"/>
+            </w:tcBorders>
+            <w:tcMar>
+              <w:top w:type="dxa" w:w="60"/>
+              <w:left w:type="dxa" w:w="100"/>
+              <w:bottom w:type="dxa" w:w="60"/>
+              <w:right w:type="dxa" w:w="100"/>
+            </w:tcMar>
+          </w:tcPr>
+          <w:p>
+            <w:r>
+              <w:rPr>
+                <w:b w:val="false"/>
+                <w:bCs w:val="false"/>
+                <w:sz w:val="19"/>
+                <w:szCs w:val="19"/>
+              </w:rPr>
               <w:t xml:space="preserve">out/ (todos los .class)</w:t>
             </w:r>
           </w:p>
@@ -751,7 +1014,7 @@
                 <w:sz w:val="19"/>
                 <w:szCs w:val="19"/>
               </w:rPr>
-              <w:t xml:space="preserve">Compilados viejos del diseño anterior. No van en el repo.</w:t>
+              <w:t xml:space="preserve">Compilados viejos. No van en el repo.</w:t>
             </w:r>
           </w:p>
         </w:tc>
@@ -762,7 +1025,565 @@
         <w:pStyle w:val="Heading1"/>
       </w:pPr>
       <w:r>
-        <w:t xml:space="preserve">4. Estructura nueva (MVC)</w:t>
+        <w:t xml:space="preserve">4. Pantallas (las acordadas con el profe)</w:t>
+      </w:r>
+    </w:p>
+    <w:tbl>
+      <w:tblPr>
+        <w:tblW w:type="dxa" w:w="9026"/>
+        <w:tblBorders>
+          <w:top w:val="single" w:color="auto" w:sz="4"/>
+          <w:left w:val="single" w:color="auto" w:sz="4"/>
+          <w:bottom w:val="single" w:color="auto" w:sz="4"/>
+          <w:right w:val="single" w:color="auto" w:sz="4"/>
+          <w:insideH w:val="single" w:color="auto" w:sz="4"/>
+          <w:insideV w:val="single" w:color="auto" w:sz="4"/>
+        </w:tblBorders>
+      </w:tblPr>
+      <w:tblGrid>
+        <w:gridCol w:w="2200"/>
+        <w:gridCol w:w="4826"/>
+        <w:gridCol w:w="2000"/>
+      </w:tblGrid>
+      <w:tr>
+        <w:trPr>
+          <w:tblHeader/>
+        </w:trPr>
+        <w:tc>
+          <w:tcPr>
+            <w:tcW w:type="dxa" w:w="2200"/>
+            <w:tcBorders>
+              <w:top w:val="single" w:color="C8CDD6" w:sz="4"/>
+              <w:left w:val="single" w:color="C8CDD6" w:sz="4"/>
+              <w:bottom w:val="single" w:color="C8CDD6" w:sz="4"/>
+              <w:right w:val="single" w:color="C8CDD6" w:sz="4"/>
+            </w:tcBorders>
+            <w:shd w:fill="2E4A7A" w:color="auto" w:val="clear"/>
+            <w:tcMar>
+              <w:top w:type="dxa" w:w="60"/>
+              <w:left w:type="dxa" w:w="100"/>
+              <w:bottom w:type="dxa" w:w="60"/>
+              <w:right w:type="dxa" w:w="100"/>
+            </w:tcMar>
+          </w:tcPr>
+          <w:p>
+            <w:r>
+              <w:rPr>
+                <w:b/>
+                <w:bCs/>
+                <w:color w:val="FFFFFF"/>
+                <w:sz w:val="19"/>
+                <w:szCs w:val="19"/>
+              </w:rPr>
+              <w:t xml:space="preserve">Pantalla</w:t>
+            </w:r>
+          </w:p>
+        </w:tc>
+        <w:tc>
+          <w:tcPr>
+            <w:tcW w:type="dxa" w:w="4826"/>
+            <w:tcBorders>
+              <w:top w:val="single" w:color="C8CDD6" w:sz="4"/>
+              <w:left w:val="single" w:color="C8CDD6" w:sz="4"/>
+              <w:bottom w:val="single" w:color="C8CDD6" w:sz="4"/>
+              <w:right w:val="single" w:color="C8CDD6" w:sz="4"/>
+            </w:tcBorders>
+            <w:shd w:fill="2E4A7A" w:color="auto" w:val="clear"/>
+            <w:tcMar>
+              <w:top w:type="dxa" w:w="60"/>
+              <w:left w:type="dxa" w:w="100"/>
+              <w:bottom w:type="dxa" w:w="60"/>
+              <w:right w:type="dxa" w:w="100"/>
+            </w:tcMar>
+          </w:tcPr>
+          <w:p>
+            <w:r>
+              <w:rPr>
+                <w:b/>
+                <w:bCs/>
+                <w:color w:val="FFFFFF"/>
+                <w:sz w:val="19"/>
+                <w:szCs w:val="19"/>
+              </w:rPr>
+              <w:t xml:space="preserve">Qué tiene</w:t>
+            </w:r>
+          </w:p>
+        </w:tc>
+        <w:tc>
+          <w:tcPr>
+            <w:tcW w:type="dxa" w:w="2000"/>
+            <w:tcBorders>
+              <w:top w:val="single" w:color="C8CDD6" w:sz="4"/>
+              <w:left w:val="single" w:color="C8CDD6" w:sz="4"/>
+              <w:bottom w:val="single" w:color="C8CDD6" w:sz="4"/>
+              <w:right w:val="single" w:color="C8CDD6" w:sz="4"/>
+            </w:tcBorders>
+            <w:shd w:fill="2E4A7A" w:color="auto" w:val="clear"/>
+            <w:tcMar>
+              <w:top w:type="dxa" w:w="60"/>
+              <w:left w:type="dxa" w:w="100"/>
+              <w:bottom w:type="dxa" w:w="60"/>
+              <w:right w:type="dxa" w:w="100"/>
+            </w:tcMar>
+          </w:tcPr>
+          <w:p>
+            <w:r>
+              <w:rPr>
+                <w:b/>
+                <w:bCs/>
+                <w:color w:val="FFFFFF"/>
+                <w:sz w:val="19"/>
+                <w:szCs w:val="19"/>
+              </w:rPr>
+              <w:t xml:space="preserve">Estado</w:t>
+            </w:r>
+          </w:p>
+        </w:tc>
+      </w:tr>
+      <w:tr>
+        <w:tc>
+          <w:tcPr>
+            <w:tcW w:type="dxa" w:w="2200"/>
+            <w:tcBorders>
+              <w:top w:val="single" w:color="C8CDD6" w:sz="4"/>
+              <w:left w:val="single" w:color="C8CDD6" w:sz="4"/>
+              <w:bottom w:val="single" w:color="C8CDD6" w:sz="4"/>
+              <w:right w:val="single" w:color="C8CDD6" w:sz="4"/>
+            </w:tcBorders>
+            <w:tcMar>
+              <w:top w:type="dxa" w:w="60"/>
+              <w:left w:type="dxa" w:w="100"/>
+              <w:bottom w:type="dxa" w:w="60"/>
+              <w:right w:type="dxa" w:w="100"/>
+            </w:tcMar>
+          </w:tcPr>
+          <w:p>
+            <w:r>
+              <w:rPr>
+                <w:b w:val="false"/>
+                <w:bCs w:val="false"/>
+                <w:sz w:val="19"/>
+                <w:szCs w:val="19"/>
+              </w:rPr>
+              <w:t xml:space="preserve">Menú / Inicio</w:t>
+            </w:r>
+          </w:p>
+        </w:tc>
+        <w:tc>
+          <w:tcPr>
+            <w:tcW w:type="dxa" w:w="4826"/>
+            <w:tcBorders>
+              <w:top w:val="single" w:color="C8CDD6" w:sz="4"/>
+              <w:left w:val="single" w:color="C8CDD6" w:sz="4"/>
+              <w:bottom w:val="single" w:color="C8CDD6" w:sz="4"/>
+              <w:right w:val="single" w:color="C8CDD6" w:sz="4"/>
+            </w:tcBorders>
+            <w:tcMar>
+              <w:top w:type="dxa" w:w="60"/>
+              <w:left w:type="dxa" w:w="100"/>
+              <w:bottom w:type="dxa" w:w="60"/>
+              <w:right w:type="dxa" w:w="100"/>
+            </w:tcMar>
+          </w:tcPr>
+          <w:p>
+            <w:r>
+              <w:rPr>
+                <w:b w:val="false"/>
+                <w:bCs w:val="false"/>
+                <w:sz w:val="19"/>
+                <w:szCs w:val="19"/>
+              </w:rPr>
+              <w:t xml:space="preserve">Iniciar partida · Cargar partida · Cerrar juego</w:t>
+            </w:r>
+          </w:p>
+        </w:tc>
+        <w:tc>
+          <w:tcPr>
+            <w:tcW w:type="dxa" w:w="2000"/>
+            <w:tcBorders>
+              <w:top w:val="single" w:color="C8CDD6" w:sz="4"/>
+              <w:left w:val="single" w:color="C8CDD6" w:sz="4"/>
+              <w:bottom w:val="single" w:color="C8CDD6" w:sz="4"/>
+              <w:right w:val="single" w:color="C8CDD6" w:sz="4"/>
+            </w:tcBorders>
+            <w:tcMar>
+              <w:top w:type="dxa" w:w="60"/>
+              <w:left w:type="dxa" w:w="100"/>
+              <w:bottom w:type="dxa" w:w="60"/>
+              <w:right w:type="dxa" w:w="100"/>
+            </w:tcMar>
+          </w:tcPr>
+          <w:p>
+            <w:r>
+              <w:rPr>
+                <w:b w:val="false"/>
+                <w:bCs w:val="false"/>
+                <w:sz w:val="19"/>
+                <w:szCs w:val="19"/>
+              </w:rPr>
+              <w:t xml:space="preserve">Funciona</w:t>
+            </w:r>
+          </w:p>
+        </w:tc>
+      </w:tr>
+      <w:tr>
+        <w:tc>
+          <w:tcPr>
+            <w:tcW w:type="dxa" w:w="2200"/>
+            <w:tcBorders>
+              <w:top w:val="single" w:color="C8CDD6" w:sz="4"/>
+              <w:left w:val="single" w:color="C8CDD6" w:sz="4"/>
+              <w:bottom w:val="single" w:color="C8CDD6" w:sz="4"/>
+              <w:right w:val="single" w:color="C8CDD6" w:sz="4"/>
+            </w:tcBorders>
+            <w:tcMar>
+              <w:top w:type="dxa" w:w="60"/>
+              <w:left w:type="dxa" w:w="100"/>
+              <w:bottom w:type="dxa" w:w="60"/>
+              <w:right w:type="dxa" w:w="100"/>
+            </w:tcMar>
+          </w:tcPr>
+          <w:p>
+            <w:r>
+              <w:rPr>
+                <w:b w:val="false"/>
+                <w:bCs w:val="false"/>
+                <w:sz w:val="19"/>
+                <w:szCs w:val="19"/>
+              </w:rPr>
+              <w:t xml:space="preserve">Partidas guardadas</w:t>
+            </w:r>
+          </w:p>
+        </w:tc>
+        <w:tc>
+          <w:tcPr>
+            <w:tcW w:type="dxa" w:w="4826"/>
+            <w:tcBorders>
+              <w:top w:val="single" w:color="C8CDD6" w:sz="4"/>
+              <w:left w:val="single" w:color="C8CDD6" w:sz="4"/>
+              <w:bottom w:val="single" w:color="C8CDD6" w:sz="4"/>
+              <w:right w:val="single" w:color="C8CDD6" w:sz="4"/>
+            </w:tcBorders>
+            <w:tcMar>
+              <w:top w:type="dxa" w:w="60"/>
+              <w:left w:type="dxa" w:w="100"/>
+              <w:bottom w:type="dxa" w:w="60"/>
+              <w:right w:type="dxa" w:w="100"/>
+            </w:tcMar>
+          </w:tcPr>
+          <w:p>
+            <w:r>
+              <w:rPr>
+                <w:b w:val="false"/>
+                <w:bCs w:val="false"/>
+                <w:sz w:val="19"/>
+                <w:szCs w:val="19"/>
+              </w:rPr>
+              <w:t xml:space="preserve">La abre "Cargar partida". Lista de partidas para elegir.</w:t>
+            </w:r>
+          </w:p>
+        </w:tc>
+        <w:tc>
+          <w:tcPr>
+            <w:tcW w:type="dxa" w:w="2000"/>
+            <w:tcBorders>
+              <w:top w:val="single" w:color="C8CDD6" w:sz="4"/>
+              <w:left w:val="single" w:color="C8CDD6" w:sz="4"/>
+              <w:bottom w:val="single" w:color="C8CDD6" w:sz="4"/>
+              <w:right w:val="single" w:color="C8CDD6" w:sz="4"/>
+            </w:tcBorders>
+            <w:tcMar>
+              <w:top w:type="dxa" w:w="60"/>
+              <w:left w:type="dxa" w:w="100"/>
+              <w:bottom w:type="dxa" w:w="60"/>
+              <w:right w:type="dxa" w:w="100"/>
+            </w:tcMar>
+          </w:tcPr>
+          <w:p>
+            <w:r>
+              <w:rPr>
+                <w:b w:val="false"/>
+                <w:bCs w:val="false"/>
+                <w:sz w:val="19"/>
+                <w:szCs w:val="19"/>
+              </w:rPr>
+              <w:t xml:space="preserve">Maqueta (falta el guardado)</w:t>
+            </w:r>
+          </w:p>
+        </w:tc>
+      </w:tr>
+      <w:tr>
+        <w:tc>
+          <w:tcPr>
+            <w:tcW w:type="dxa" w:w="2200"/>
+            <w:tcBorders>
+              <w:top w:val="single" w:color="C8CDD6" w:sz="4"/>
+              <w:left w:val="single" w:color="C8CDD6" w:sz="4"/>
+              <w:bottom w:val="single" w:color="C8CDD6" w:sz="4"/>
+              <w:right w:val="single" w:color="C8CDD6" w:sz="4"/>
+            </w:tcBorders>
+            <w:tcMar>
+              <w:top w:type="dxa" w:w="60"/>
+              <w:left w:type="dxa" w:w="100"/>
+              <w:bottom w:type="dxa" w:w="60"/>
+              <w:right w:type="dxa" w:w="100"/>
+            </w:tcMar>
+          </w:tcPr>
+          <w:p>
+            <w:r>
+              <w:rPr>
+                <w:b w:val="false"/>
+                <w:bCs w:val="false"/>
+                <w:sz w:val="19"/>
+                <w:szCs w:val="19"/>
+              </w:rPr>
+              <w:t xml:space="preserve">Batalla</w:t>
+            </w:r>
+          </w:p>
+        </w:tc>
+        <w:tc>
+          <w:tcPr>
+            <w:tcW w:type="dxa" w:w="4826"/>
+            <w:tcBorders>
+              <w:top w:val="single" w:color="C8CDD6" w:sz="4"/>
+              <w:left w:val="single" w:color="C8CDD6" w:sz="4"/>
+              <w:bottom w:val="single" w:color="C8CDD6" w:sz="4"/>
+              <w:right w:val="single" w:color="C8CDD6" w:sz="4"/>
+            </w:tcBorders>
+            <w:tcMar>
+              <w:top w:type="dxa" w:w="60"/>
+              <w:left w:type="dxa" w:w="100"/>
+              <w:bottom w:type="dxa" w:w="60"/>
+              <w:right w:type="dxa" w:w="100"/>
+            </w:tcMar>
+          </w:tcPr>
+          <w:p>
+            <w:r>
+              <w:rPr>
+                <w:b w:val="false"/>
+                <w:bCs w:val="false"/>
+                <w:sz w:val="19"/>
+                <w:szCs w:val="19"/>
+              </w:rPr>
+              <w:t xml:space="preserve">Enemigo, party con vida/maná/estados, orden de la ronda, de quién es el turno, botones de acción, log. Al terminar: "Ver resumen".</w:t>
+            </w:r>
+          </w:p>
+        </w:tc>
+        <w:tc>
+          <w:tcPr>
+            <w:tcW w:type="dxa" w:w="2000"/>
+            <w:tcBorders>
+              <w:top w:val="single" w:color="C8CDD6" w:sz="4"/>
+              <w:left w:val="single" w:color="C8CDD6" w:sz="4"/>
+              <w:bottom w:val="single" w:color="C8CDD6" w:sz="4"/>
+              <w:right w:val="single" w:color="C8CDD6" w:sz="4"/>
+            </w:tcBorders>
+            <w:tcMar>
+              <w:top w:type="dxa" w:w="60"/>
+              <w:left w:type="dxa" w:w="100"/>
+              <w:bottom w:type="dxa" w:w="60"/>
+              <w:right w:type="dxa" w:w="100"/>
+            </w:tcMar>
+          </w:tcPr>
+          <w:p>
+            <w:r>
+              <w:rPr>
+                <w:b w:val="false"/>
+                <w:bCs w:val="false"/>
+                <w:sz w:val="19"/>
+                <w:szCs w:val="19"/>
+              </w:rPr>
+              <w:t xml:space="preserve">Funciona</w:t>
+            </w:r>
+          </w:p>
+        </w:tc>
+      </w:tr>
+      <w:tr>
+        <w:tc>
+          <w:tcPr>
+            <w:tcW w:type="dxa" w:w="2200"/>
+            <w:tcBorders>
+              <w:top w:val="single" w:color="C8CDD6" w:sz="4"/>
+              <w:left w:val="single" w:color="C8CDD6" w:sz="4"/>
+              <w:bottom w:val="single" w:color="C8CDD6" w:sz="4"/>
+              <w:right w:val="single" w:color="C8CDD6" w:sz="4"/>
+            </w:tcBorders>
+            <w:tcMar>
+              <w:top w:type="dxa" w:w="60"/>
+              <w:left w:type="dxa" w:w="100"/>
+              <w:bottom w:type="dxa" w:w="60"/>
+              <w:right w:type="dxa" w:w="100"/>
+            </w:tcMar>
+          </w:tcPr>
+          <w:p>
+            <w:r>
+              <w:rPr>
+                <w:b w:val="false"/>
+                <w:bCs w:val="false"/>
+                <w:sz w:val="19"/>
+                <w:szCs w:val="19"/>
+              </w:rPr>
+              <w:t xml:space="preserve">Resumen de batalla</w:t>
+            </w:r>
+          </w:p>
+        </w:tc>
+        <w:tc>
+          <w:tcPr>
+            <w:tcW w:type="dxa" w:w="4826"/>
+            <w:tcBorders>
+              <w:top w:val="single" w:color="C8CDD6" w:sz="4"/>
+              <w:left w:val="single" w:color="C8CDD6" w:sz="4"/>
+              <w:bottom w:val="single" w:color="C8CDD6" w:sz="4"/>
+              <w:right w:val="single" w:color="C8CDD6" w:sz="4"/>
+            </w:tcBorders>
+            <w:tcMar>
+              <w:top w:type="dxa" w:w="60"/>
+              <w:left w:type="dxa" w:w="100"/>
+              <w:bottom w:type="dxa" w:w="60"/>
+              <w:right w:type="dxa" w:w="100"/>
+            </w:tcMar>
+          </w:tcPr>
+          <w:p>
+            <w:r>
+              <w:rPr>
+                <w:b w:val="false"/>
+                <w:bCs w:val="false"/>
+                <w:sz w:val="19"/>
+                <w:szCs w:val="19"/>
+              </w:rPr>
+              <w:t xml:space="preserve">Victoria/derrota, experiencia, quién subió de nivel y el estado de toda la party. Botones: Siguiente piso · Inventario · Guardar · Menú.</w:t>
+            </w:r>
+          </w:p>
+        </w:tc>
+        <w:tc>
+          <w:tcPr>
+            <w:tcW w:type="dxa" w:w="2000"/>
+            <w:tcBorders>
+              <w:top w:val="single" w:color="C8CDD6" w:sz="4"/>
+              <w:left w:val="single" w:color="C8CDD6" w:sz="4"/>
+              <w:bottom w:val="single" w:color="C8CDD6" w:sz="4"/>
+              <w:right w:val="single" w:color="C8CDD6" w:sz="4"/>
+            </w:tcBorders>
+            <w:tcMar>
+              <w:top w:type="dxa" w:w="60"/>
+              <w:left w:type="dxa" w:w="100"/>
+              <w:bottom w:type="dxa" w:w="60"/>
+              <w:right w:type="dxa" w:w="100"/>
+            </w:tcMar>
+          </w:tcPr>
+          <w:p>
+            <w:r>
+              <w:rPr>
+                <w:b w:val="false"/>
+                <w:bCs w:val="false"/>
+                <w:sz w:val="19"/>
+                <w:szCs w:val="19"/>
+              </w:rPr>
+              <w:t xml:space="preserve">Funciona (Guardar avisa que falta)</w:t>
+            </w:r>
+          </w:p>
+        </w:tc>
+      </w:tr>
+      <w:tr>
+        <w:tc>
+          <w:tcPr>
+            <w:tcW w:type="dxa" w:w="2200"/>
+            <w:tcBorders>
+              <w:top w:val="single" w:color="C8CDD6" w:sz="4"/>
+              <w:left w:val="single" w:color="C8CDD6" w:sz="4"/>
+              <w:bottom w:val="single" w:color="C8CDD6" w:sz="4"/>
+              <w:right w:val="single" w:color="C8CDD6" w:sz="4"/>
+            </w:tcBorders>
+            <w:tcMar>
+              <w:top w:type="dxa" w:w="60"/>
+              <w:left w:type="dxa" w:w="100"/>
+              <w:bottom w:type="dxa" w:w="60"/>
+              <w:right w:type="dxa" w:w="100"/>
+            </w:tcMar>
+          </w:tcPr>
+          <w:p>
+            <w:r>
+              <w:rPr>
+                <w:b w:val="false"/>
+                <w:bCs w:val="false"/>
+                <w:sz w:val="19"/>
+                <w:szCs w:val="19"/>
+              </w:rPr>
+              <w:t xml:space="preserve">Inventario</w:t>
+            </w:r>
+          </w:p>
+        </w:tc>
+        <w:tc>
+          <w:tcPr>
+            <w:tcW w:type="dxa" w:w="4826"/>
+            <w:tcBorders>
+              <w:top w:val="single" w:color="C8CDD6" w:sz="4"/>
+              <w:left w:val="single" w:color="C8CDD6" w:sz="4"/>
+              <w:bottom w:val="single" w:color="C8CDD6" w:sz="4"/>
+              <w:right w:val="single" w:color="C8CDD6" w:sz="4"/>
+            </w:tcBorders>
+            <w:tcMar>
+              <w:top w:type="dxa" w:w="60"/>
+              <w:left w:type="dxa" w:w="100"/>
+              <w:bottom w:type="dxa" w:w="60"/>
+              <w:right w:type="dxa" w:w="100"/>
+            </w:tcMar>
+          </w:tcPr>
+          <w:p>
+            <w:r>
+              <w:rPr>
+                <w:b w:val="false"/>
+                <w:bCs w:val="false"/>
+                <w:sz w:val="19"/>
+                <w:szCs w:val="19"/>
+              </w:rPr>
+              <w:t xml:space="preserve">6 espacios. Se abre desde el Resumen.</w:t>
+            </w:r>
+          </w:p>
+        </w:tc>
+        <w:tc>
+          <w:tcPr>
+            <w:tcW w:type="dxa" w:w="2000"/>
+            <w:tcBorders>
+              <w:top w:val="single" w:color="C8CDD6" w:sz="4"/>
+              <w:left w:val="single" w:color="C8CDD6" w:sz="4"/>
+              <w:bottom w:val="single" w:color="C8CDD6" w:sz="4"/>
+              <w:right w:val="single" w:color="C8CDD6" w:sz="4"/>
+            </w:tcBorders>
+            <w:tcMar>
+              <w:top w:type="dxa" w:w="60"/>
+              <w:left w:type="dxa" w:w="100"/>
+              <w:bottom w:type="dxa" w:w="60"/>
+              <w:right w:type="dxa" w:w="100"/>
+            </w:tcMar>
+          </w:tcPr>
+          <w:p>
+            <w:r>
+              <w:rPr>
+                <w:b w:val="false"/>
+                <w:bCs w:val="false"/>
+                <w:sz w:val="19"/>
+                <w:szCs w:val="19"/>
+              </w:rPr>
+              <w:t xml:space="preserve">Maqueta (faltan los ítems)</w:t>
+            </w:r>
+          </w:p>
+        </w:tc>
+      </w:tr>
+    </w:tbl>
+    <w:p>
+      <w:pPr>
+        <w:spacing w:after="80" w:before="120"/>
+      </w:pPr>
+      <w:r>
+        <w:t xml:space="preserve">Flujo: </w:t>
+      </w:r>
+      <w:r>
+        <w:rPr>
+          <w:b/>
+          <w:bCs/>
+        </w:rPr>
+        <w:t xml:space="preserve">Menú → Batalla piso 1 → Resumen → Batalla piso 2 → … → gana el piso 10 o cae toda la party → Menú.</w:t>
       </w:r>
     </w:p>
     <w:p>
@@ -770,7 +1591,341 @@
         <w:spacing w:after="120"/>
       </w:pPr>
       <w:r>
-        <w:t xml:space="preserve">El profe pide MVC. Antes había un solo paquete Personajes con todo mezclado y la Vista tenía lógica de juego adentro. Ahora cada capa está separada:</w:t>
+        <w:t xml:space="preserve">El Resumen de batalla cubre en una sola pantalla dos de las mínimas que pide la cátedra: "estado de personaje/party" y "resultados/resumen". Así llegamos al mínimo indispensable sin pantallas de más.</w:t>
+      </w:r>
+    </w:p>
+    <w:tbl>
+      <w:tblPr>
+        <w:tblW w:type="dxa" w:w="9026"/>
+        <w:tblBorders>
+          <w:top w:val="single" w:color="auto" w:sz="4"/>
+          <w:left w:val="single" w:color="auto" w:sz="4"/>
+          <w:bottom w:val="single" w:color="auto" w:sz="4"/>
+          <w:right w:val="single" w:color="auto" w:sz="4"/>
+          <w:insideH w:val="single" w:color="auto" w:sz="4"/>
+          <w:insideV w:val="single" w:color="auto" w:sz="4"/>
+        </w:tblBorders>
+      </w:tblPr>
+      <w:tblGrid>
+        <w:gridCol w:w="4513"/>
+        <w:gridCol w:w="4513"/>
+      </w:tblGrid>
+      <w:tr>
+        <w:tc>
+          <w:tcPr>
+            <w:tcW w:type="dxa" w:w="4513"/>
+            <w:tcBorders>
+              <w:top w:val="none" w:color="FFFFFF" w:sz="0"/>
+              <w:left w:val="none" w:color="FFFFFF" w:sz="0"/>
+              <w:bottom w:val="none" w:color="FFFFFF" w:sz="0"/>
+              <w:right w:val="none" w:color="FFFFFF" w:sz="0"/>
+            </w:tcBorders>
+          </w:tcPr>
+          <w:p>
+            <w:pPr>
+              <w:jc w:val="center"/>
+            </w:pPr>
+            <w:r>
+              <w:drawing>
+                <wp:inline distT="0" distB="0" distL="0" distR="0">
+                  <wp:extent cx="2762250" cy="1952625"/>
+                  <wp:effectExtent t="0" r="0" b="0" l="0"/>
+                  <wp:docPr id="1" name="" descr="" title=""/>
+                  <wp:cNvGraphicFramePr>
+                    <a:graphicFrameLocks xmlns:a="http://schemas.openxmlformats.org/drawingml/2006/main" noChangeAspect="1"/>
+                  </wp:cNvGraphicFramePr>
+                  <a:graphic xmlns:a="http://schemas.openxmlformats.org/drawingml/2006/main">
+                    <a:graphicData uri="http://schemas.openxmlformats.org/drawingml/2006/picture">
+                      <pic:pic xmlns:pic="http://schemas.openxmlformats.org/drawingml/2006/picture">
+                        <pic:nvPicPr>
+                          <pic:cNvPr id="0" name="" descr=""/>
+                          <pic:cNvPicPr>
+                            <a:picLocks noChangeAspect="1" noChangeArrowheads="1"/>
+                          </pic:cNvPicPr>
+                        </pic:nvPicPr>
+                        <pic:blipFill>
+                          <a:blip r:embed="rId8" cstate="none"/>
+                          <a:srcRect/>
+                          <a:stretch>
+                            <a:fillRect/>
+                          </a:stretch>
+                        </pic:blipFill>
+                        <pic:spPr bwMode="auto">
+                          <a:xfrm>
+                            <a:off x="0" y="0"/>
+                            <a:ext cx="2762250" cy="1952625"/>
+                          </a:xfrm>
+                          <a:prstGeom prst="rect">
+                            <a:avLst/>
+                          </a:prstGeom>
+                        </pic:spPr>
+                      </pic:pic>
+                    </a:graphicData>
+                  </a:graphic>
+                </wp:inline>
+              </w:drawing>
+            </w:r>
+          </w:p>
+          <w:p>
+            <w:pPr>
+              <w:spacing w:after="120"/>
+              <w:jc w:val="center"/>
+            </w:pPr>
+            <w:r>
+              <w:rPr>
+                <w:i/>
+                <w:iCs/>
+                <w:color w:val="666666"/>
+                <w:sz w:val="18"/>
+                <w:szCs w:val="18"/>
+              </w:rPr>
+              <w:t xml:space="preserve">Menú</w:t>
+            </w:r>
+          </w:p>
+        </w:tc>
+        <w:tc>
+          <w:tcPr>
+            <w:tcW w:type="dxa" w:w="4513"/>
+            <w:tcBorders>
+              <w:top w:val="none" w:color="FFFFFF" w:sz="0"/>
+              <w:left w:val="none" w:color="FFFFFF" w:sz="0"/>
+              <w:bottom w:val="none" w:color="FFFFFF" w:sz="0"/>
+              <w:right w:val="none" w:color="FFFFFF" w:sz="0"/>
+            </w:tcBorders>
+          </w:tcPr>
+          <w:p>
+            <w:pPr>
+              <w:jc w:val="center"/>
+            </w:pPr>
+            <w:r>
+              <w:drawing>
+                <wp:inline distT="0" distB="0" distL="0" distR="0">
+                  <wp:extent cx="2762250" cy="1952625"/>
+                  <wp:effectExtent t="0" r="0" b="0" l="0"/>
+                  <wp:docPr id="1" name="" descr="" title=""/>
+                  <wp:cNvGraphicFramePr>
+                    <a:graphicFrameLocks xmlns:a="http://schemas.openxmlformats.org/drawingml/2006/main" noChangeAspect="1"/>
+                  </wp:cNvGraphicFramePr>
+                  <a:graphic xmlns:a="http://schemas.openxmlformats.org/drawingml/2006/main">
+                    <a:graphicData uri="http://schemas.openxmlformats.org/drawingml/2006/picture">
+                      <pic:pic xmlns:pic="http://schemas.openxmlformats.org/drawingml/2006/picture">
+                        <pic:nvPicPr>
+                          <pic:cNvPr id="0" name="" descr=""/>
+                          <pic:cNvPicPr>
+                            <a:picLocks noChangeAspect="1" noChangeArrowheads="1"/>
+                          </pic:cNvPicPr>
+                        </pic:nvPicPr>
+                        <pic:blipFill>
+                          <a:blip r:embed="rId9" cstate="none"/>
+                          <a:srcRect/>
+                          <a:stretch>
+                            <a:fillRect/>
+                          </a:stretch>
+                        </pic:blipFill>
+                        <pic:spPr bwMode="auto">
+                          <a:xfrm>
+                            <a:off x="0" y="0"/>
+                            <a:ext cx="2762250" cy="1952625"/>
+                          </a:xfrm>
+                          <a:prstGeom prst="rect">
+                            <a:avLst/>
+                          </a:prstGeom>
+                        </pic:spPr>
+                      </pic:pic>
+                    </a:graphicData>
+                  </a:graphic>
+                </wp:inline>
+              </w:drawing>
+            </w:r>
+          </w:p>
+          <w:p>
+            <w:pPr>
+              <w:spacing w:after="120"/>
+              <w:jc w:val="center"/>
+            </w:pPr>
+            <w:r>
+              <w:rPr>
+                <w:i/>
+                <w:iCs/>
+                <w:color w:val="666666"/>
+                <w:sz w:val="18"/>
+                <w:szCs w:val="18"/>
+              </w:rPr>
+              <w:t xml:space="preserve">Partidas guardadas (maqueta)</w:t>
+            </w:r>
+          </w:p>
+        </w:tc>
+      </w:tr>
+    </w:tbl>
+    <w:tbl>
+      <w:tblPr>
+        <w:tblW w:type="dxa" w:w="9026"/>
+        <w:tblBorders>
+          <w:top w:val="single" w:color="auto" w:sz="4"/>
+          <w:left w:val="single" w:color="auto" w:sz="4"/>
+          <w:bottom w:val="single" w:color="auto" w:sz="4"/>
+          <w:right w:val="single" w:color="auto" w:sz="4"/>
+          <w:insideH w:val="single" w:color="auto" w:sz="4"/>
+          <w:insideV w:val="single" w:color="auto" w:sz="4"/>
+        </w:tblBorders>
+      </w:tblPr>
+      <w:tblGrid>
+        <w:gridCol w:w="4513"/>
+        <w:gridCol w:w="4513"/>
+      </w:tblGrid>
+      <w:tr>
+        <w:tc>
+          <w:tcPr>
+            <w:tcW w:type="dxa" w:w="4513"/>
+            <w:tcBorders>
+              <w:top w:val="none" w:color="FFFFFF" w:sz="0"/>
+              <w:left w:val="none" w:color="FFFFFF" w:sz="0"/>
+              <w:bottom w:val="none" w:color="FFFFFF" w:sz="0"/>
+              <w:right w:val="none" w:color="FFFFFF" w:sz="0"/>
+            </w:tcBorders>
+          </w:tcPr>
+          <w:p>
+            <w:pPr>
+              <w:jc w:val="center"/>
+            </w:pPr>
+            <w:r>
+              <w:drawing>
+                <wp:inline distT="0" distB="0" distL="0" distR="0">
+                  <wp:extent cx="2762250" cy="1952625"/>
+                  <wp:effectExtent t="0" r="0" b="0" l="0"/>
+                  <wp:docPr id="1" name="" descr="" title=""/>
+                  <wp:cNvGraphicFramePr>
+                    <a:graphicFrameLocks xmlns:a="http://schemas.openxmlformats.org/drawingml/2006/main" noChangeAspect="1"/>
+                  </wp:cNvGraphicFramePr>
+                  <a:graphic xmlns:a="http://schemas.openxmlformats.org/drawingml/2006/main">
+                    <a:graphicData uri="http://schemas.openxmlformats.org/drawingml/2006/picture">
+                      <pic:pic xmlns:pic="http://schemas.openxmlformats.org/drawingml/2006/picture">
+                        <pic:nvPicPr>
+                          <pic:cNvPr id="0" name="" descr=""/>
+                          <pic:cNvPicPr>
+                            <a:picLocks noChangeAspect="1" noChangeArrowheads="1"/>
+                          </pic:cNvPicPr>
+                        </pic:nvPicPr>
+                        <pic:blipFill>
+                          <a:blip r:embed="rId10" cstate="none"/>
+                          <a:srcRect/>
+                          <a:stretch>
+                            <a:fillRect/>
+                          </a:stretch>
+                        </pic:blipFill>
+                        <pic:spPr bwMode="auto">
+                          <a:xfrm>
+                            <a:off x="0" y="0"/>
+                            <a:ext cx="2762250" cy="1952625"/>
+                          </a:xfrm>
+                          <a:prstGeom prst="rect">
+                            <a:avLst/>
+                          </a:prstGeom>
+                        </pic:spPr>
+                      </pic:pic>
+                    </a:graphicData>
+                  </a:graphic>
+                </wp:inline>
+              </w:drawing>
+            </w:r>
+          </w:p>
+          <w:p>
+            <w:pPr>
+              <w:spacing w:after="120"/>
+              <w:jc w:val="center"/>
+            </w:pPr>
+            <w:r>
+              <w:rPr>
+                <w:i/>
+                <w:iCs/>
+                <w:color w:val="666666"/>
+                <w:sz w:val="18"/>
+                <w:szCs w:val="18"/>
+              </w:rPr>
+              <w:t xml:space="preserve">Batalla</w:t>
+            </w:r>
+          </w:p>
+        </w:tc>
+        <w:tc>
+          <w:tcPr>
+            <w:tcW w:type="dxa" w:w="4513"/>
+            <w:tcBorders>
+              <w:top w:val="none" w:color="FFFFFF" w:sz="0"/>
+              <w:left w:val="none" w:color="FFFFFF" w:sz="0"/>
+              <w:bottom w:val="none" w:color="FFFFFF" w:sz="0"/>
+              <w:right w:val="none" w:color="FFFFFF" w:sz="0"/>
+            </w:tcBorders>
+          </w:tcPr>
+          <w:p>
+            <w:pPr>
+              <w:jc w:val="center"/>
+            </w:pPr>
+            <w:r>
+              <w:drawing>
+                <wp:inline distT="0" distB="0" distL="0" distR="0">
+                  <wp:extent cx="2762250" cy="1952625"/>
+                  <wp:effectExtent t="0" r="0" b="0" l="0"/>
+                  <wp:docPr id="1" name="" descr="" title=""/>
+                  <wp:cNvGraphicFramePr>
+                    <a:graphicFrameLocks xmlns:a="http://schemas.openxmlformats.org/drawingml/2006/main" noChangeAspect="1"/>
+                  </wp:cNvGraphicFramePr>
+                  <a:graphic xmlns:a="http://schemas.openxmlformats.org/drawingml/2006/main">
+                    <a:graphicData uri="http://schemas.openxmlformats.org/drawingml/2006/picture">
+                      <pic:pic xmlns:pic="http://schemas.openxmlformats.org/drawingml/2006/picture">
+                        <pic:nvPicPr>
+                          <pic:cNvPr id="0" name="" descr=""/>
+                          <pic:cNvPicPr>
+                            <a:picLocks noChangeAspect="1" noChangeArrowheads="1"/>
+                          </pic:cNvPicPr>
+                        </pic:nvPicPr>
+                        <pic:blipFill>
+                          <a:blip r:embed="rId11" cstate="none"/>
+                          <a:srcRect/>
+                          <a:stretch>
+                            <a:fillRect/>
+                          </a:stretch>
+                        </pic:blipFill>
+                        <pic:spPr bwMode="auto">
+                          <a:xfrm>
+                            <a:off x="0" y="0"/>
+                            <a:ext cx="2762250" cy="1952625"/>
+                          </a:xfrm>
+                          <a:prstGeom prst="rect">
+                            <a:avLst/>
+                          </a:prstGeom>
+                        </pic:spPr>
+                      </pic:pic>
+                    </a:graphicData>
+                  </a:graphic>
+                </wp:inline>
+              </w:drawing>
+            </w:r>
+          </w:p>
+          <w:p>
+            <w:pPr>
+              <w:spacing w:after="120"/>
+              <w:jc w:val="center"/>
+            </w:pPr>
+            <w:r>
+              <w:rPr>
+                <w:i/>
+                <w:iCs/>
+                <w:color w:val="666666"/>
+                <w:sz w:val="18"/>
+                <w:szCs w:val="18"/>
+              </w:rPr>
+              <w:t xml:space="preserve">Resumen de batalla</w:t>
+            </w:r>
+          </w:p>
+        </w:tc>
+      </w:tr>
+    </w:tbl>
+    <w:p>
+      <w:pPr>
+        <w:pStyle w:val="Heading1"/>
+      </w:pPr>
+      <w:r>
+        <w:t xml:space="preserve">5. Estructura del código (MVC)</w:t>
       </w:r>
     </w:p>
     <w:tbl>
@@ -938,7 +2093,7 @@
                 <w:sz w:val="19"/>
                 <w:szCs w:val="19"/>
               </w:rPr>
-              <w:t xml:space="preserve">Combatiente, Party, Batalla, GeneradorDeEnemigos</w:t>
+              <w:t xml:space="preserve">Combatiente, Party, Batalla, Partida, ResultadoDeBatalla, GeneradorDeEnemigos</w:t>
             </w:r>
           </w:p>
         </w:tc>
@@ -1110,7 +2265,7 @@
                 <w:sz w:val="19"/>
                 <w:szCs w:val="19"/>
               </w:rPr>
-              <w:t xml:space="preserve">Enemigo, Slime, Goblin, Jefe, JefeFinal, Esqueleto</w:t>
+              <w:t xml:space="preserve">Enemigo, Slime, Goblin, Jefe, JefeFinal</w:t>
             </w:r>
           </w:p>
         </w:tc>
@@ -1196,7 +2351,7 @@
                 <w:sz w:val="19"/>
                 <w:szCs w:val="19"/>
               </w:rPr>
-              <w:t xml:space="preserve">Habilidad, AtaqueConMultiplicador, DisparoCertero, Sanacion, Revivir</w:t>
+              <w:t xml:space="preserve">Habilidad, AtaqueConMultiplicador, Curacion</w:t>
             </w:r>
           </w:p>
         </w:tc>
@@ -1282,7 +2437,7 @@
                 <w:sz w:val="19"/>
                 <w:szCs w:val="19"/>
               </w:rPr>
-              <w:t xml:space="preserve">ControladorDeBatalla</w:t>
+              <w:t xml:space="preserve">ControladorDeJuego, ControladorDeBatalla</w:t>
             </w:r>
           </w:p>
         </w:tc>
@@ -1310,7 +2465,7 @@
                 <w:sz w:val="19"/>
                 <w:szCs w:val="19"/>
               </w:rPr>
-              <w:t xml:space="preserve">Recibe la acción del jugador, la manda al modelo y devuelve el texto de lo que pasó.</w:t>
+              <w:t xml:space="preserve">Reciben la acción del jugador, la mandan al modelo y devuelven qué pasó.</w:t>
             </w:r>
           </w:p>
         </w:tc>
@@ -1368,7 +2523,7 @@
                 <w:sz w:val="19"/>
                 <w:szCs w:val="19"/>
               </w:rPr>
-              <w:t xml:space="preserve">VentanaPrincipal + 4 pantallas</w:t>
+              <w:t xml:space="preserve">VentanaPrincipal + 5 pantallas</w:t>
             </w:r>
           </w:p>
         </w:tc>
@@ -1396,7 +2551,7 @@
                 <w:sz w:val="19"/>
                 <w:szCs w:val="19"/>
               </w:rPr>
-              <w:t xml:space="preserve">Solo dibuja y avisa qué botón se tocó.</w:t>
+              <w:t xml:space="preserve">Solo dibujan y avisan qué botón se tocó.</w:t>
             </w:r>
           </w:p>
         </w:tc>
@@ -1482,7 +2637,7 @@
                 <w:sz w:val="19"/>
                 <w:szCs w:val="19"/>
               </w:rPr>
-              <w:t xml:space="preserve">Vista de prueba por consola. Usa el MISMO controlador que Swing.</w:t>
+              <w:t xml:space="preserve">Vista de prueba. Usa los MISMOS controladores que Swing.</w:t>
             </w:r>
           </w:p>
         </w:tc>
@@ -1493,7 +2648,7 @@
         <w:spacing w:after="120" w:before="120"/>
       </w:pPr>
       <w:r>
-        <w:t xml:space="preserve">Lo lindo de esto para defenderlo en la cátedra: </w:t>
+        <w:t xml:space="preserve">Para defenderlo en la cátedra: </w:t>
       </w:r>
       <w:r>
         <w:rPr>
@@ -1511,7 +2666,7 @@
         <w:pStyle w:val="Heading1"/>
       </w:pPr>
       <w:r>
-        <w:t xml:space="preserve">5. Qué cambió, clase por clase</w:t>
+        <w:t xml:space="preserve">6. Qué cambió, clase por clase</w:t>
       </w:r>
     </w:p>
     <w:p>
@@ -1536,8 +2691,8 @@
       </w:tblPr>
       <w:tblGrid>
         <w:gridCol w:w="2300"/>
-        <w:gridCol w:w="3900"/>
-        <w:gridCol w:w="2826"/>
+        <w:gridCol w:w="4100"/>
+        <w:gridCol w:w="2626"/>
       </w:tblGrid>
       <w:tr>
         <w:trPr>
@@ -1575,7 +2730,7 @@
         </w:tc>
         <w:tc>
           <w:tcPr>
-            <w:tcW w:type="dxa" w:w="3900"/>
+            <w:tcW w:type="dxa" w:w="4100"/>
             <w:tcBorders>
               <w:top w:val="single" w:color="C8CDD6" w:sz="4"/>
               <w:left w:val="single" w:color="C8CDD6" w:sz="4"/>
@@ -1605,7 +2760,7 @@
         </w:tc>
         <w:tc>
           <w:tcPr>
-            <w:tcW w:type="dxa" w:w="2826"/>
+            <w:tcW w:type="dxa" w:w="2626"/>
             <w:tcBorders>
               <w:top w:val="single" w:color="C8CDD6" w:sz="4"/>
               <w:left w:val="single" w:color="C8CDD6" w:sz="4"/>
@@ -1629,7 +2784,7 @@
                 <w:sz w:val="19"/>
                 <w:szCs w:val="19"/>
               </w:rPr>
-              <w:t xml:space="preserve">Concepto que aplica</w:t>
+              <w:t xml:space="preserve">Concepto</w:t>
             </w:r>
           </w:p>
         </w:tc>
@@ -1665,57 +2820,57 @@
         </w:tc>
         <w:tc>
           <w:tcPr>
-            <w:tcW w:type="dxa" w:w="3900"/>
-            <w:tcBorders>
-              <w:top w:val="single" w:color="C8CDD6" w:sz="4"/>
-              <w:left w:val="single" w:color="C8CDD6" w:sz="4"/>
-              <w:bottom w:val="single" w:color="C8CDD6" w:sz="4"/>
-              <w:right w:val="single" w:color="C8CDD6" w:sz="4"/>
-            </w:tcBorders>
-            <w:tcMar>
-              <w:top w:type="dxa" w:w="60"/>
-              <w:left w:type="dxa" w:w="100"/>
-              <w:bottom w:type="dxa" w:w="60"/>
-              <w:right w:type="dxa" w:w="100"/>
-            </w:tcMar>
-          </w:tcPr>
-          <w:p>
-            <w:r>
-              <w:rPr>
-                <w:b w:val="false"/>
-                <w:bCs w:val="false"/>
-                <w:sz w:val="19"/>
-                <w:szCs w:val="19"/>
-              </w:rPr>
-              <w:t xml:space="preserve">Nombre + costo de maná + ejecutar(usuario, objetivo). Cada personaje "tiene" 2.</w:t>
-            </w:r>
-          </w:p>
-        </w:tc>
-        <w:tc>
-          <w:tcPr>
-            <w:tcW w:type="dxa" w:w="2826"/>
-            <w:tcBorders>
-              <w:top w:val="single" w:color="C8CDD6" w:sz="4"/>
-              <w:left w:val="single" w:color="C8CDD6" w:sz="4"/>
-              <w:bottom w:val="single" w:color="C8CDD6" w:sz="4"/>
-              <w:right w:val="single" w:color="C8CDD6" w:sz="4"/>
-            </w:tcBorders>
-            <w:tcMar>
-              <w:top w:type="dxa" w:w="60"/>
-              <w:left w:type="dxa" w:w="100"/>
-              <w:bottom w:type="dxa" w:w="60"/>
-              <w:right w:type="dxa" w:w="100"/>
-            </w:tcMar>
-          </w:tcPr>
-          <w:p>
-            <w:r>
-              <w:rPr>
-                <w:b w:val="false"/>
-                <w:bCs w:val="false"/>
-                <w:sz w:val="19"/>
-                <w:szCs w:val="19"/>
-              </w:rPr>
-              <w:t xml:space="preserve">Polimorfismo, composición. Coincide con el diagrama de secuencia 2 (HabilidadPoderosa.getCosto/ejecutar).</w:t>
+            <w:tcW w:type="dxa" w:w="4100"/>
+            <w:tcBorders>
+              <w:top w:val="single" w:color="C8CDD6" w:sz="4"/>
+              <w:left w:val="single" w:color="C8CDD6" w:sz="4"/>
+              <w:bottom w:val="single" w:color="C8CDD6" w:sz="4"/>
+              <w:right w:val="single" w:color="C8CDD6" w:sz="4"/>
+            </w:tcBorders>
+            <w:tcMar>
+              <w:top w:type="dxa" w:w="60"/>
+              <w:left w:type="dxa" w:w="100"/>
+              <w:bottom w:type="dxa" w:w="60"/>
+              <w:right w:type="dxa" w:w="100"/>
+            </w:tcMar>
+          </w:tcPr>
+          <w:p>
+            <w:r>
+              <w:rPr>
+                <w:b w:val="false"/>
+                <w:bCs w:val="false"/>
+                <w:sz w:val="19"/>
+                <w:szCs w:val="19"/>
+              </w:rPr>
+              <w:t xml:space="preserve">Nombre + costo de maná + ejecutar(usuario, objetivo). Cada personaje tiene 2.</w:t>
+            </w:r>
+          </w:p>
+        </w:tc>
+        <w:tc>
+          <w:tcPr>
+            <w:tcW w:type="dxa" w:w="2626"/>
+            <w:tcBorders>
+              <w:top w:val="single" w:color="C8CDD6" w:sz="4"/>
+              <w:left w:val="single" w:color="C8CDD6" w:sz="4"/>
+              <w:bottom w:val="single" w:color="C8CDD6" w:sz="4"/>
+              <w:right w:val="single" w:color="C8CDD6" w:sz="4"/>
+            </w:tcBorders>
+            <w:tcMar>
+              <w:top w:type="dxa" w:w="60"/>
+              <w:left w:type="dxa" w:w="100"/>
+              <w:bottom w:type="dxa" w:w="60"/>
+              <w:right w:type="dxa" w:w="100"/>
+            </w:tcMar>
+          </w:tcPr>
+          <w:p>
+            <w:r>
+              <w:rPr>
+                <w:b w:val="false"/>
+                <w:bCs w:val="false"/>
+                <w:sz w:val="19"/>
+                <w:szCs w:val="19"/>
+              </w:rPr>
+              <w:t xml:space="preserve">Polimorfismo. Coincide con el diagrama de secuencia 2.</w:t>
             </w:r>
           </w:p>
         </w:tc>
@@ -1751,57 +2906,57 @@
         </w:tc>
         <w:tc>
           <w:tcPr>
-            <w:tcW w:type="dxa" w:w="3900"/>
-            <w:tcBorders>
-              <w:top w:val="single" w:color="C8CDD6" w:sz="4"/>
-              <w:left w:val="single" w:color="C8CDD6" w:sz="4"/>
-              <w:bottom w:val="single" w:color="C8CDD6" w:sz="4"/>
-              <w:right w:val="single" w:color="C8CDD6" w:sz="4"/>
-            </w:tcBorders>
-            <w:tcMar>
-              <w:top w:type="dxa" w:w="60"/>
-              <w:left w:type="dxa" w:w="100"/>
-              <w:bottom w:type="dxa" w:w="60"/>
-              <w:right w:type="dxa" w:w="100"/>
-            </w:tcMar>
-          </w:tcPr>
-          <w:p>
-            <w:r>
-              <w:rPr>
-                <w:b w:val="false"/>
-                <w:bCs w:val="false"/>
-                <w:sz w:val="19"/>
-                <w:szCs w:val="19"/>
-              </w:rPr>
-              <w:t xml:space="preserve">Una sola clase para Tajo, Golpe Poderoso, Chispa, Bola de Fuego y Lluvia de Flechas (cambian solo los datos).</w:t>
-            </w:r>
-          </w:p>
-        </w:tc>
-        <w:tc>
-          <w:tcPr>
-            <w:tcW w:type="dxa" w:w="2826"/>
-            <w:tcBorders>
-              <w:top w:val="single" w:color="C8CDD6" w:sz="4"/>
-              <w:left w:val="single" w:color="C8CDD6" w:sz="4"/>
-              <w:bottom w:val="single" w:color="C8CDD6" w:sz="4"/>
-              <w:right w:val="single" w:color="C8CDD6" w:sz="4"/>
-            </w:tcBorders>
-            <w:tcMar>
-              <w:top w:type="dxa" w:w="60"/>
-              <w:left w:type="dxa" w:w="100"/>
-              <w:bottom w:type="dxa" w:w="60"/>
-              <w:right w:type="dxa" w:w="100"/>
-            </w:tcMar>
-          </w:tcPr>
-          <w:p>
-            <w:r>
-              <w:rPr>
-                <w:b w:val="false"/>
-                <w:bCs w:val="false"/>
-                <w:sz w:val="19"/>
-                <w:szCs w:val="19"/>
-              </w:rPr>
-              <w:t xml:space="preserve">Evita código repetido: antes eran 5 copias casi iguales.</w:t>
+            <w:tcW w:type="dxa" w:w="4100"/>
+            <w:tcBorders>
+              <w:top w:val="single" w:color="C8CDD6" w:sz="4"/>
+              <w:left w:val="single" w:color="C8CDD6" w:sz="4"/>
+              <w:bottom w:val="single" w:color="C8CDD6" w:sz="4"/>
+              <w:right w:val="single" w:color="C8CDD6" w:sz="4"/>
+            </w:tcBorders>
+            <w:tcMar>
+              <w:top w:type="dxa" w:w="60"/>
+              <w:left w:type="dxa" w:w="100"/>
+              <w:bottom w:type="dxa" w:w="60"/>
+              <w:right w:type="dxa" w:w="100"/>
+            </w:tcMar>
+          </w:tcPr>
+          <w:p>
+            <w:r>
+              <w:rPr>
+                <w:b w:val="false"/>
+                <w:bCs w:val="false"/>
+                <w:sz w:val="19"/>
+                <w:szCs w:val="19"/>
+              </w:rPr>
+              <w:t xml:space="preserve">Una sola clase para las 6 habilidades de daño del documento (cambian solo los datos).</w:t>
+            </w:r>
+          </w:p>
+        </w:tc>
+        <w:tc>
+          <w:tcPr>
+            <w:tcW w:type="dxa" w:w="2626"/>
+            <w:tcBorders>
+              <w:top w:val="single" w:color="C8CDD6" w:sz="4"/>
+              <w:left w:val="single" w:color="C8CDD6" w:sz="4"/>
+              <w:bottom w:val="single" w:color="C8CDD6" w:sz="4"/>
+              <w:right w:val="single" w:color="C8CDD6" w:sz="4"/>
+            </w:tcBorders>
+            <w:tcMar>
+              <w:top w:type="dxa" w:w="60"/>
+              <w:left w:type="dxa" w:w="100"/>
+              <w:bottom w:type="dxa" w:w="60"/>
+              <w:right w:type="dxa" w:w="100"/>
+            </w:tcMar>
+          </w:tcPr>
+          <w:p>
+            <w:r>
+              <w:rPr>
+                <w:b w:val="false"/>
+                <w:bCs w:val="false"/>
+                <w:sz w:val="19"/>
+                <w:szCs w:val="19"/>
+              </w:rPr>
+              <w:t xml:space="preserve">Evita 6 copias del mismo código.</w:t>
             </w:r>
           </w:p>
         </w:tc>
@@ -1831,41 +2986,41 @@
                 <w:sz w:val="19"/>
                 <w:szCs w:val="19"/>
               </w:rPr>
-              <w:t xml:space="preserve">DisparoCertero, Sanacion, Revivir</w:t>
-            </w:r>
-          </w:p>
-        </w:tc>
-        <w:tc>
-          <w:tcPr>
-            <w:tcW w:type="dxa" w:w="3900"/>
-            <w:tcBorders>
-              <w:top w:val="single" w:color="C8CDD6" w:sz="4"/>
-              <w:left w:val="single" w:color="C8CDD6" w:sz="4"/>
-              <w:bottom w:val="single" w:color="C8CDD6" w:sz="4"/>
-              <w:right w:val="single" w:color="C8CDD6" w:sz="4"/>
-            </w:tcBorders>
-            <w:tcMar>
-              <w:top w:type="dxa" w:w="60"/>
-              <w:left w:type="dxa" w:w="100"/>
-              <w:bottom w:type="dxa" w:w="60"/>
-              <w:right w:type="dxa" w:w="100"/>
-            </w:tcMar>
-          </w:tcPr>
-          <w:p>
-            <w:r>
-              <w:rPr>
-                <w:b w:val="false"/>
-                <w:bCs w:val="false"/>
-                <w:sz w:val="19"/>
-                <w:szCs w:val="19"/>
-              </w:rPr>
-              <w:t xml:space="preserve">Las 3 habilidades con comportamiento propio.</w:t>
-            </w:r>
-          </w:p>
-        </w:tc>
-        <w:tc>
-          <w:tcPr>
-            <w:tcW w:type="dxa" w:w="2826"/>
+              <w:t xml:space="preserve">Curacion</w:t>
+            </w:r>
+          </w:p>
+        </w:tc>
+        <w:tc>
+          <w:tcPr>
+            <w:tcW w:type="dxa" w:w="4100"/>
+            <w:tcBorders>
+              <w:top w:val="single" w:color="C8CDD6" w:sz="4"/>
+              <w:left w:val="single" w:color="C8CDD6" w:sz="4"/>
+              <w:bottom w:val="single" w:color="C8CDD6" w:sz="4"/>
+              <w:right w:val="single" w:color="C8CDD6" w:sz="4"/>
+            </w:tcBorders>
+            <w:tcMar>
+              <w:top w:type="dxa" w:w="60"/>
+              <w:left w:type="dxa" w:w="100"/>
+              <w:bottom w:type="dxa" w:w="60"/>
+              <w:right w:type="dxa" w:w="100"/>
+            </w:tcMar>
+          </w:tcPr>
+          <w:p>
+            <w:r>
+              <w:rPr>
+                <w:b w:val="false"/>
+                <w:bCs w:val="false"/>
+                <w:sz w:val="19"/>
+                <w:szCs w:val="19"/>
+              </w:rPr>
+              <w:t xml:space="preserve">Sanación (cura 20) y Sanación Mayor (cura 45), solo sobre aliados vivos.</w:t>
+            </w:r>
+          </w:p>
+        </w:tc>
+        <w:tc>
+          <w:tcPr>
+            <w:tcW w:type="dxa" w:w="2626"/>
             <w:tcBorders>
               <w:top w:val="single" w:color="C8CDD6" w:sz="4"/>
               <w:left w:val="single" w:color="C8CDD6" w:sz="4"/>
@@ -1917,63 +3072,63 @@
                 <w:sz w:val="19"/>
                 <w:szCs w:val="19"/>
               </w:rPr>
-              <w:t xml:space="preserve">ControladorDeBatalla</w:t>
-            </w:r>
-          </w:p>
-        </w:tc>
-        <w:tc>
-          <w:tcPr>
-            <w:tcW w:type="dxa" w:w="3900"/>
-            <w:tcBorders>
-              <w:top w:val="single" w:color="C8CDD6" w:sz="4"/>
-              <w:left w:val="single" w:color="C8CDD6" w:sz="4"/>
-              <w:bottom w:val="single" w:color="C8CDD6" w:sz="4"/>
-              <w:right w:val="single" w:color="C8CDD6" w:sz="4"/>
-            </w:tcBorders>
-            <w:tcMar>
-              <w:top w:type="dxa" w:w="60"/>
-              <w:left w:type="dxa" w:w="100"/>
-              <w:bottom w:type="dxa" w:w="60"/>
-              <w:right w:type="dxa" w:w="100"/>
-            </w:tcMar>
-          </w:tcPr>
-          <w:p>
-            <w:r>
-              <w:rPr>
-                <w:b w:val="false"/>
-                <w:bCs w:val="false"/>
-                <w:sz w:val="19"/>
-                <w:szCs w:val="19"/>
-              </w:rPr>
-              <w:t xml:space="preserve">atacar(), usarHabilidad(), defender(). Juega solo los turnos del enemigo y los aturdidos. Reparte experiencia al ganar.</w:t>
-            </w:r>
-          </w:p>
-        </w:tc>
-        <w:tc>
-          <w:tcPr>
-            <w:tcW w:type="dxa" w:w="2826"/>
-            <w:tcBorders>
-              <w:top w:val="single" w:color="C8CDD6" w:sz="4"/>
-              <w:left w:val="single" w:color="C8CDD6" w:sz="4"/>
-              <w:bottom w:val="single" w:color="C8CDD6" w:sz="4"/>
-              <w:right w:val="single" w:color="C8CDD6" w:sz="4"/>
-            </w:tcBorders>
-            <w:tcMar>
-              <w:top w:type="dxa" w:w="60"/>
-              <w:left w:type="dxa" w:w="100"/>
-              <w:bottom w:type="dxa" w:w="60"/>
-              <w:right w:type="dxa" w:w="100"/>
-            </w:tcMar>
-          </w:tcPr>
-          <w:p>
-            <w:r>
-              <w:rPr>
-                <w:b w:val="false"/>
-                <w:bCs w:val="false"/>
-                <w:sz w:val="19"/>
-                <w:szCs w:val="19"/>
-              </w:rPr>
-              <w:t xml:space="preserve">GRASP Controlador, MVC.</w:t>
+              <w:t xml:space="preserve">Partida</w:t>
+            </w:r>
+          </w:p>
+        </w:tc>
+        <w:tc>
+          <w:tcPr>
+            <w:tcW w:type="dxa" w:w="4100"/>
+            <w:tcBorders>
+              <w:top w:val="single" w:color="C8CDD6" w:sz="4"/>
+              <w:left w:val="single" w:color="C8CDD6" w:sz="4"/>
+              <w:bottom w:val="single" w:color="C8CDD6" w:sz="4"/>
+              <w:right w:val="single" w:color="C8CDD6" w:sz="4"/>
+            </w:tcBorders>
+            <w:tcMar>
+              <w:top w:type="dxa" w:w="60"/>
+              <w:left w:type="dxa" w:w="100"/>
+              <w:bottom w:type="dxa" w:w="60"/>
+              <w:right w:type="dxa" w:w="100"/>
+            </w:tcMar>
+          </w:tcPr>
+          <w:p>
+            <w:r>
+              <w:rPr>
+                <w:b w:val="false"/>
+                <w:bCs w:val="false"/>
+                <w:sz w:val="19"/>
+                <w:szCs w:val="19"/>
+              </w:rPr>
+              <w:t xml:space="preserve">La party y el piso actual. Sube de piso al ganar, termina al ganar el 10 o al perder.</w:t>
+            </w:r>
+          </w:p>
+        </w:tc>
+        <w:tc>
+          <w:tcPr>
+            <w:tcW w:type="dxa" w:w="2626"/>
+            <w:tcBorders>
+              <w:top w:val="single" w:color="C8CDD6" w:sz="4"/>
+              <w:left w:val="single" w:color="C8CDD6" w:sz="4"/>
+              <w:bottom w:val="single" w:color="C8CDD6" w:sz="4"/>
+              <w:right w:val="single" w:color="C8CDD6" w:sz="4"/>
+            </w:tcBorders>
+            <w:tcMar>
+              <w:top w:type="dxa" w:w="60"/>
+              <w:left w:type="dxa" w:w="100"/>
+              <w:bottom w:type="dxa" w:w="60"/>
+              <w:right w:type="dxa" w:w="100"/>
+            </w:tcMar>
+          </w:tcPr>
+          <w:p>
+            <w:r>
+              <w:rPr>
+                <w:b w:val="false"/>
+                <w:bCs w:val="false"/>
+                <w:sz w:val="19"/>
+                <w:szCs w:val="19"/>
+              </w:rPr>
+              <w:t xml:space="preserve">Lo que después se va a guardar en archivo.</w:t>
             </w:r>
           </w:p>
         </w:tc>
@@ -2003,63 +3158,63 @@
                 <w:sz w:val="19"/>
                 <w:szCs w:val="19"/>
               </w:rPr>
-              <w:t xml:space="preserve">GeneradorDeEnemigos</w:t>
-            </w:r>
-          </w:p>
-        </w:tc>
-        <w:tc>
-          <w:tcPr>
-            <w:tcW w:type="dxa" w:w="3900"/>
-            <w:tcBorders>
-              <w:top w:val="single" w:color="C8CDD6" w:sz="4"/>
-              <w:left w:val="single" w:color="C8CDD6" w:sz="4"/>
-              <w:bottom w:val="single" w:color="C8CDD6" w:sz="4"/>
-              <w:right w:val="single" w:color="C8CDD6" w:sz="4"/>
-            </w:tcBorders>
-            <w:tcMar>
-              <w:top w:type="dxa" w:w="60"/>
-              <w:left w:type="dxa" w:w="100"/>
-              <w:bottom w:type="dxa" w:w="60"/>
-              <w:right w:type="dxa" w:w="100"/>
-            </w:tcMar>
-          </w:tcPr>
-          <w:p>
-            <w:r>
-              <w:rPr>
-                <w:b w:val="false"/>
-                <w:bCs w:val="false"/>
-                <w:sz w:val="19"/>
-                <w:szCs w:val="19"/>
-              </w:rPr>
-              <w:t xml:space="preserve">Crea el enemigo de cada piso: jefes en 5 y 10, Slime/Goblin al azar en el resto, con +10% por piso.</w:t>
-            </w:r>
-          </w:p>
-        </w:tc>
-        <w:tc>
-          <w:tcPr>
-            <w:tcW w:type="dxa" w:w="2826"/>
-            <w:tcBorders>
-              <w:top w:val="single" w:color="C8CDD6" w:sz="4"/>
-              <w:left w:val="single" w:color="C8CDD6" w:sz="4"/>
-              <w:bottom w:val="single" w:color="C8CDD6" w:sz="4"/>
-              <w:right w:val="single" w:color="C8CDD6" w:sz="4"/>
-            </w:tcBorders>
-            <w:tcMar>
-              <w:top w:type="dxa" w:w="60"/>
-              <w:left w:type="dxa" w:w="100"/>
-              <w:bottom w:type="dxa" w:w="60"/>
-              <w:right w:type="dxa" w:w="100"/>
-            </w:tcMar>
-          </w:tcPr>
-          <w:p>
-            <w:r>
-              <w:rPr>
-                <w:b w:val="false"/>
-                <w:bCs w:val="false"/>
-                <w:sz w:val="19"/>
-                <w:szCs w:val="19"/>
-              </w:rPr>
-              <w:t xml:space="preserve">GRASP Creador. Antes esto lo decidía la pantalla.</w:t>
+              <w:t xml:space="preserve">ResultadoDeBatalla</w:t>
+            </w:r>
+          </w:p>
+        </w:tc>
+        <w:tc>
+          <w:tcPr>
+            <w:tcW w:type="dxa" w:w="4100"/>
+            <w:tcBorders>
+              <w:top w:val="single" w:color="C8CDD6" w:sz="4"/>
+              <w:left w:val="single" w:color="C8CDD6" w:sz="4"/>
+              <w:bottom w:val="single" w:color="C8CDD6" w:sz="4"/>
+              <w:right w:val="single" w:color="C8CDD6" w:sz="4"/>
+            </w:tcBorders>
+            <w:tcMar>
+              <w:top w:type="dxa" w:w="60"/>
+              <w:left w:type="dxa" w:w="100"/>
+              <w:bottom w:type="dxa" w:w="60"/>
+              <w:right w:type="dxa" w:w="100"/>
+            </w:tcMar>
+          </w:tcPr>
+          <w:p>
+            <w:r>
+              <w:rPr>
+                <w:b w:val="false"/>
+                <w:bCs w:val="false"/>
+                <w:sz w:val="19"/>
+                <w:szCs w:val="19"/>
+              </w:rPr>
+              <w:t xml:space="preserve">Los datos de una batalla terminada, para la pantalla de Resumen.</w:t>
+            </w:r>
+          </w:p>
+        </w:tc>
+        <w:tc>
+          <w:tcPr>
+            <w:tcW w:type="dxa" w:w="2626"/>
+            <w:tcBorders>
+              <w:top w:val="single" w:color="C8CDD6" w:sz="4"/>
+              <w:left w:val="single" w:color="C8CDD6" w:sz="4"/>
+              <w:bottom w:val="single" w:color="C8CDD6" w:sz="4"/>
+              <w:right w:val="single" w:color="C8CDD6" w:sz="4"/>
+            </w:tcBorders>
+            <w:tcMar>
+              <w:top w:type="dxa" w:w="60"/>
+              <w:left w:type="dxa" w:w="100"/>
+              <w:bottom w:type="dxa" w:w="60"/>
+              <w:right w:type="dxa" w:w="100"/>
+            </w:tcMar>
+          </w:tcPr>
+          <w:p>
+            <w:r>
+              <w:rPr>
+                <w:b w:val="false"/>
+                <w:bCs w:val="false"/>
+                <w:sz w:val="19"/>
+                <w:szCs w:val="19"/>
+              </w:rPr>
+              <w:t xml:space="preserve">Objeto de datos (sin setters).</w:t>
             </w:r>
           </w:p>
         </w:tc>
@@ -2089,63 +3244,321 @@
                 <w:sz w:val="19"/>
                 <w:szCs w:val="19"/>
               </w:rPr>
-              <w:t xml:space="preserve">JuegoConsola</w:t>
-            </w:r>
-          </w:p>
-        </w:tc>
-        <w:tc>
-          <w:tcPr>
-            <w:tcW w:type="dxa" w:w="3900"/>
-            <w:tcBorders>
-              <w:top w:val="single" w:color="C8CDD6" w:sz="4"/>
-              <w:left w:val="single" w:color="C8CDD6" w:sz="4"/>
-              <w:bottom w:val="single" w:color="C8CDD6" w:sz="4"/>
-              <w:right w:val="single" w:color="C8CDD6" w:sz="4"/>
-            </w:tcBorders>
-            <w:tcMar>
-              <w:top w:type="dxa" w:w="60"/>
-              <w:left w:type="dxa" w:w="100"/>
-              <w:bottom w:type="dxa" w:w="60"/>
-              <w:right w:type="dxa" w:w="100"/>
-            </w:tcMar>
-          </w:tcPr>
-          <w:p>
-            <w:r>
-              <w:rPr>
-                <w:b w:val="false"/>
-                <w:bCs w:val="false"/>
-                <w:sz w:val="19"/>
-                <w:szCs w:val="19"/>
-              </w:rPr>
-              <w:t xml:space="preserve">Batalla de prueba por consola (reemplaza Main viejo + MotorDeCombate).</w:t>
-            </w:r>
-          </w:p>
-        </w:tc>
-        <w:tc>
-          <w:tcPr>
-            <w:tcW w:type="dxa" w:w="2826"/>
-            <w:tcBorders>
-              <w:top w:val="single" w:color="C8CDD6" w:sz="4"/>
-              <w:left w:val="single" w:color="C8CDD6" w:sz="4"/>
-              <w:bottom w:val="single" w:color="C8CDD6" w:sz="4"/>
-              <w:right w:val="single" w:color="C8CDD6" w:sz="4"/>
-            </w:tcBorders>
-            <w:tcMar>
-              <w:top w:type="dxa" w:w="60"/>
-              <w:left w:type="dxa" w:w="100"/>
-              <w:bottom w:type="dxa" w:w="60"/>
-              <w:right w:type="dxa" w:w="100"/>
-            </w:tcMar>
-          </w:tcPr>
-          <w:p>
-            <w:r>
-              <w:rPr>
-                <w:b w:val="false"/>
-                <w:bCs w:val="false"/>
-                <w:sz w:val="19"/>
-                <w:szCs w:val="19"/>
-              </w:rPr>
-              <w:t xml:space="preserve">Vista alternativa.</w:t>
+              <w:t xml:space="preserve">ControladorDeJuego</w:t>
+            </w:r>
+          </w:p>
+        </w:tc>
+        <w:tc>
+          <w:tcPr>
+            <w:tcW w:type="dxa" w:w="4100"/>
+            <w:tcBorders>
+              <w:top w:val="single" w:color="C8CDD6" w:sz="4"/>
+              <w:left w:val="single" w:color="C8CDD6" w:sz="4"/>
+              <w:bottom w:val="single" w:color="C8CDD6" w:sz="4"/>
+              <w:right w:val="single" w:color="C8CDD6" w:sz="4"/>
+            </w:tcBorders>
+            <w:tcMar>
+              <w:top w:type="dxa" w:w="60"/>
+              <w:left w:type="dxa" w:w="100"/>
+              <w:bottom w:type="dxa" w:w="60"/>
+              <w:right w:type="dxa" w:w="100"/>
+            </w:tcMar>
+          </w:tcPr>
+          <w:p>
+            <w:r>
+              <w:rPr>
+                <w:b w:val="false"/>
+                <w:bCs w:val="false"/>
+                <w:sz w:val="19"/>
+                <w:szCs w:val="19"/>
+              </w:rPr>
+              <w:t xml:space="preserve">Lo que pasa entre batallas: nueva partida, arrancar el piso actual, cerrar la batalla.</w:t>
+            </w:r>
+          </w:p>
+        </w:tc>
+        <w:tc>
+          <w:tcPr>
+            <w:tcW w:type="dxa" w:w="2626"/>
+            <w:tcBorders>
+              <w:top w:val="single" w:color="C8CDD6" w:sz="4"/>
+              <w:left w:val="single" w:color="C8CDD6" w:sz="4"/>
+              <w:bottom w:val="single" w:color="C8CDD6" w:sz="4"/>
+              <w:right w:val="single" w:color="C8CDD6" w:sz="4"/>
+            </w:tcBorders>
+            <w:tcMar>
+              <w:top w:type="dxa" w:w="60"/>
+              <w:left w:type="dxa" w:w="100"/>
+              <w:bottom w:type="dxa" w:w="60"/>
+              <w:right w:type="dxa" w:w="100"/>
+            </w:tcMar>
+          </w:tcPr>
+          <w:p>
+            <w:r>
+              <w:rPr>
+                <w:b w:val="false"/>
+                <w:bCs w:val="false"/>
+                <w:sz w:val="19"/>
+                <w:szCs w:val="19"/>
+              </w:rPr>
+              <w:t xml:space="preserve">GRASP Controlador.</w:t>
+            </w:r>
+          </w:p>
+        </w:tc>
+      </w:tr>
+      <w:tr>
+        <w:tc>
+          <w:tcPr>
+            <w:tcW w:type="dxa" w:w="2300"/>
+            <w:tcBorders>
+              <w:top w:val="single" w:color="C8CDD6" w:sz="4"/>
+              <w:left w:val="single" w:color="C8CDD6" w:sz="4"/>
+              <w:bottom w:val="single" w:color="C8CDD6" w:sz="4"/>
+              <w:right w:val="single" w:color="C8CDD6" w:sz="4"/>
+            </w:tcBorders>
+            <w:tcMar>
+              <w:top w:type="dxa" w:w="60"/>
+              <w:left w:type="dxa" w:w="100"/>
+              <w:bottom w:type="dxa" w:w="60"/>
+              <w:right w:type="dxa" w:w="100"/>
+            </w:tcMar>
+          </w:tcPr>
+          <w:p>
+            <w:r>
+              <w:rPr>
+                <w:b w:val="false"/>
+                <w:bCs w:val="false"/>
+                <w:sz w:val="19"/>
+                <w:szCs w:val="19"/>
+              </w:rPr>
+              <w:t xml:space="preserve">ControladorDeBatalla</w:t>
+            </w:r>
+          </w:p>
+        </w:tc>
+        <w:tc>
+          <w:tcPr>
+            <w:tcW w:type="dxa" w:w="4100"/>
+            <w:tcBorders>
+              <w:top w:val="single" w:color="C8CDD6" w:sz="4"/>
+              <w:left w:val="single" w:color="C8CDD6" w:sz="4"/>
+              <w:bottom w:val="single" w:color="C8CDD6" w:sz="4"/>
+              <w:right w:val="single" w:color="C8CDD6" w:sz="4"/>
+            </w:tcBorders>
+            <w:tcMar>
+              <w:top w:type="dxa" w:w="60"/>
+              <w:left w:type="dxa" w:w="100"/>
+              <w:bottom w:type="dxa" w:w="60"/>
+              <w:right w:type="dxa" w:w="100"/>
+            </w:tcMar>
+          </w:tcPr>
+          <w:p>
+            <w:r>
+              <w:rPr>
+                <w:b w:val="false"/>
+                <w:bCs w:val="false"/>
+                <w:sz w:val="19"/>
+                <w:szCs w:val="19"/>
+              </w:rPr>
+              <w:t xml:space="preserve">atacar(), usarHabilidad(), defender(). Juega solo los turnos del enemigo y de los aturdidos. Reparte experiencia.</w:t>
+            </w:r>
+          </w:p>
+        </w:tc>
+        <w:tc>
+          <w:tcPr>
+            <w:tcW w:type="dxa" w:w="2626"/>
+            <w:tcBorders>
+              <w:top w:val="single" w:color="C8CDD6" w:sz="4"/>
+              <w:left w:val="single" w:color="C8CDD6" w:sz="4"/>
+              <w:bottom w:val="single" w:color="C8CDD6" w:sz="4"/>
+              <w:right w:val="single" w:color="C8CDD6" w:sz="4"/>
+            </w:tcBorders>
+            <w:tcMar>
+              <w:top w:type="dxa" w:w="60"/>
+              <w:left w:type="dxa" w:w="100"/>
+              <w:bottom w:type="dxa" w:w="60"/>
+              <w:right w:type="dxa" w:w="100"/>
+            </w:tcMar>
+          </w:tcPr>
+          <w:p>
+            <w:r>
+              <w:rPr>
+                <w:b w:val="false"/>
+                <w:bCs w:val="false"/>
+                <w:sz w:val="19"/>
+                <w:szCs w:val="19"/>
+              </w:rPr>
+              <w:t xml:space="preserve">GRASP Controlador. Es el de los diagramas de secuencia.</w:t>
+            </w:r>
+          </w:p>
+        </w:tc>
+      </w:tr>
+      <w:tr>
+        <w:tc>
+          <w:tcPr>
+            <w:tcW w:type="dxa" w:w="2300"/>
+            <w:tcBorders>
+              <w:top w:val="single" w:color="C8CDD6" w:sz="4"/>
+              <w:left w:val="single" w:color="C8CDD6" w:sz="4"/>
+              <w:bottom w:val="single" w:color="C8CDD6" w:sz="4"/>
+              <w:right w:val="single" w:color="C8CDD6" w:sz="4"/>
+            </w:tcBorders>
+            <w:tcMar>
+              <w:top w:type="dxa" w:w="60"/>
+              <w:left w:type="dxa" w:w="100"/>
+              <w:bottom w:type="dxa" w:w="60"/>
+              <w:right w:type="dxa" w:w="100"/>
+            </w:tcMar>
+          </w:tcPr>
+          <w:p>
+            <w:r>
+              <w:rPr>
+                <w:b w:val="false"/>
+                <w:bCs w:val="false"/>
+                <w:sz w:val="19"/>
+                <w:szCs w:val="19"/>
+              </w:rPr>
+              <w:t xml:space="preserve">GeneradorDeEnemigos</w:t>
+            </w:r>
+          </w:p>
+        </w:tc>
+        <w:tc>
+          <w:tcPr>
+            <w:tcW w:type="dxa" w:w="4100"/>
+            <w:tcBorders>
+              <w:top w:val="single" w:color="C8CDD6" w:sz="4"/>
+              <w:left w:val="single" w:color="C8CDD6" w:sz="4"/>
+              <w:bottom w:val="single" w:color="C8CDD6" w:sz="4"/>
+              <w:right w:val="single" w:color="C8CDD6" w:sz="4"/>
+            </w:tcBorders>
+            <w:tcMar>
+              <w:top w:type="dxa" w:w="60"/>
+              <w:left w:type="dxa" w:w="100"/>
+              <w:bottom w:type="dxa" w:w="60"/>
+              <w:right w:type="dxa" w:w="100"/>
+            </w:tcMar>
+          </w:tcPr>
+          <w:p>
+            <w:r>
+              <w:rPr>
+                <w:b w:val="false"/>
+                <w:bCs w:val="false"/>
+                <w:sz w:val="19"/>
+                <w:szCs w:val="19"/>
+              </w:rPr>
+              <w:t xml:space="preserve">Slime/Goblin al azar con +10% por piso; Rey Slime en el 5 y Guardián en el 10.</w:t>
+            </w:r>
+          </w:p>
+        </w:tc>
+        <w:tc>
+          <w:tcPr>
+            <w:tcW w:type="dxa" w:w="2626"/>
+            <w:tcBorders>
+              <w:top w:val="single" w:color="C8CDD6" w:sz="4"/>
+              <w:left w:val="single" w:color="C8CDD6" w:sz="4"/>
+              <w:bottom w:val="single" w:color="C8CDD6" w:sz="4"/>
+              <w:right w:val="single" w:color="C8CDD6" w:sz="4"/>
+            </w:tcBorders>
+            <w:tcMar>
+              <w:top w:type="dxa" w:w="60"/>
+              <w:left w:type="dxa" w:w="100"/>
+              <w:bottom w:type="dxa" w:w="60"/>
+              <w:right w:type="dxa" w:w="100"/>
+            </w:tcMar>
+          </w:tcPr>
+          <w:p>
+            <w:r>
+              <w:rPr>
+                <w:b w:val="false"/>
+                <w:bCs w:val="false"/>
+                <w:sz w:val="19"/>
+                <w:szCs w:val="19"/>
+              </w:rPr>
+              <w:t xml:space="preserve">GRASP Creador.</w:t>
+            </w:r>
+          </w:p>
+        </w:tc>
+      </w:tr>
+      <w:tr>
+        <w:tc>
+          <w:tcPr>
+            <w:tcW w:type="dxa" w:w="2300"/>
+            <w:tcBorders>
+              <w:top w:val="single" w:color="C8CDD6" w:sz="4"/>
+              <w:left w:val="single" w:color="C8CDD6" w:sz="4"/>
+              <w:bottom w:val="single" w:color="C8CDD6" w:sz="4"/>
+              <w:right w:val="single" w:color="C8CDD6" w:sz="4"/>
+            </w:tcBorders>
+            <w:tcMar>
+              <w:top w:type="dxa" w:w="60"/>
+              <w:left w:type="dxa" w:w="100"/>
+              <w:bottom w:type="dxa" w:w="60"/>
+              <w:right w:type="dxa" w:w="100"/>
+            </w:tcMar>
+          </w:tcPr>
+          <w:p>
+            <w:r>
+              <w:rPr>
+                <w:b w:val="false"/>
+                <w:bCs w:val="false"/>
+                <w:sz w:val="19"/>
+                <w:szCs w:val="19"/>
+              </w:rPr>
+              <w:t xml:space="preserve">PantallaResumenBatalla, PantallaPartidasGuardadas</w:t>
+            </w:r>
+          </w:p>
+        </w:tc>
+        <w:tc>
+          <w:tcPr>
+            <w:tcW w:type="dxa" w:w="4100"/>
+            <w:tcBorders>
+              <w:top w:val="single" w:color="C8CDD6" w:sz="4"/>
+              <w:left w:val="single" w:color="C8CDD6" w:sz="4"/>
+              <w:bottom w:val="single" w:color="C8CDD6" w:sz="4"/>
+              <w:right w:val="single" w:color="C8CDD6" w:sz="4"/>
+            </w:tcBorders>
+            <w:tcMar>
+              <w:top w:type="dxa" w:w="60"/>
+              <w:left w:type="dxa" w:w="100"/>
+              <w:bottom w:type="dxa" w:w="60"/>
+              <w:right w:type="dxa" w:w="100"/>
+            </w:tcMar>
+          </w:tcPr>
+          <w:p>
+            <w:r>
+              <w:rPr>
+                <w:b w:val="false"/>
+                <w:bCs w:val="false"/>
+                <w:sz w:val="19"/>
+                <w:szCs w:val="19"/>
+              </w:rPr>
+              <w:t xml:space="preserve">Las 2 pantallas nuevas acordadas con el profe.</w:t>
+            </w:r>
+          </w:p>
+        </w:tc>
+        <w:tc>
+          <w:tcPr>
+            <w:tcW w:type="dxa" w:w="2626"/>
+            <w:tcBorders>
+              <w:top w:val="single" w:color="C8CDD6" w:sz="4"/>
+              <w:left w:val="single" w:color="C8CDD6" w:sz="4"/>
+              <w:bottom w:val="single" w:color="C8CDD6" w:sz="4"/>
+              <w:right w:val="single" w:color="C8CDD6" w:sz="4"/>
+            </w:tcBorders>
+            <w:tcMar>
+              <w:top w:type="dxa" w:w="60"/>
+              <w:left w:type="dxa" w:w="100"/>
+              <w:bottom w:type="dxa" w:w="60"/>
+              <w:right w:type="dxa" w:w="100"/>
+            </w:tcMar>
+          </w:tcPr>
+          <w:p>
+            <w:r>
+              <w:rPr>
+                <w:b w:val="false"/>
+                <w:bCs w:val="false"/>
+                <w:sz w:val="19"/>
+                <w:szCs w:val="19"/>
+              </w:rPr>
+              <w:t xml:space="preserve">Vista.</w:t>
             </w:r>
           </w:p>
         </w:tc>
@@ -2293,7 +3706,7 @@
                 <w:sz w:val="19"/>
                 <w:szCs w:val="19"/>
               </w:rPr>
-              <w:t xml:space="preserve">Recibe sus 2 Habilidad por constructor. usarHabilidad() valida y descuenta el maná en un solo lugar. Nuevos: tieneManaPara(), getAtaque(esMagico), puedeDefender(), iniciarTurno(), prepararParaNuevaBatalla(), ganarExperiencia(), describirEstados(). Ya no imprime nada: devuelve textos.</w:t>
+              <w:t xml:space="preserve">Recibe sus 2 Habilidad por constructor. Valida y descuenta el maná en un solo lugar. Nuevos: tieneManaPara(), getAtaque(esMagico), puedeDefender(), iniciarTurno(), prepararParaNuevaBatalla(), ganarExperiencia(). Solo quedan los estados del documento: Aturdimiento, Veneno y Defender. Ya no imprime nada: devuelve textos.</w:t>
             </w:r>
           </w:p>
         </w:tc>
@@ -2351,7 +3764,7 @@
                 <w:sz w:val="19"/>
                 <w:szCs w:val="19"/>
               </w:rPr>
-              <w:t xml:space="preserve">Quedaron cortitas: stats de nivel 1 + qué 2 habilidades usan. Guerrero pisa puedeDefender() = true (chau "instanceof Guerrero").</w:t>
+              <w:t xml:space="preserve">Quedaron cortitas: stats de nivel 1 y sus 2 habilidades. Guerrero pisa puedeDefender() (chau "instanceof Guerrero").</w:t>
             </w:r>
           </w:p>
         </w:tc>
@@ -2409,7 +3822,7 @@
                 <w:sz w:val="19"/>
                 <w:szCs w:val="19"/>
               </w:rPr>
-              <w:t xml:space="preserve">actuar() devuelve el mensaje en vez de imprimirlo. Nuevo atributo experienciaQueOtorga (el doc dice experiencia fija por tipo). Nuevos esJefe() y aplicarEscaladoDePiso().</w:t>
+              <w:t xml:space="preserve">Comportamientos y stats exactos del documento. actuar() devuelve el mensaje. Nuevo atributo experienciaQueOtorga.</w:t>
             </w:r>
           </w:p>
         </w:tc>
@@ -2467,7 +3880,7 @@
                 <w:sz w:val="19"/>
                 <w:szCs w:val="19"/>
               </w:rPr>
-              <w:t xml:space="preserve">Mínimo 2 / máximo 4 validado. Ahora es experta en sus miembros: getMiembrosVivos(), elegirVivoAlAzar(), estaDerrotada(), repartirExperiencia(). Coincide con el diagrama de secuencia 1.</w:t>
+              <w:t xml:space="preserve">Mínimo 2 / máximo 4. getMiembrosVivos(), elegirVivoAlAzar(), estaDerrotada(), repartirExperiencia(). Coincide con el diagrama de secuencia 1.</w:t>
             </w:r>
           </w:p>
         </w:tc>
@@ -2525,7 +3938,7 @@
                 <w:sz w:val="19"/>
                 <w:szCs w:val="19"/>
               </w:rPr>
-              <w:t xml:space="preserve">UN solo enemigo (antes array de 4). El orden por Velocidad (selection sort + desempate al azar) se mudó acá desde MotorDeCombate. Lleva la cuenta de a quién le toca.</w:t>
+              <w:t xml:space="preserve">UN solo enemigo (antes eran 4). El orden por Velocidad se mudó acá. Lleva la cuenta de a quién le toca.</w:t>
             </w:r>
           </w:p>
         </w:tc>
@@ -2583,7 +3996,7 @@
                 <w:sz w:val="19"/>
                 <w:szCs w:val="19"/>
               </w:rPr>
-              <w:t xml:space="preserve">Sin lógica de juego: solo dibuja y llama al controlador. Respeta el orden por Velocidad, muestra estados, bloquea habilidades sin maná, deja elegir a quién curar/revivir. Se fue el botón "Turno del Enemigo".</w:t>
+              <w:t xml:space="preserve">Sin lógica de juego. Respeta el orden por Velocidad, el enemigo juega solo, muestra estados, bloquea habilidades sin maná, deja elegir a quién curar.</w:t>
             </w:r>
           </w:p>
         </w:tc>
@@ -2613,7 +4026,7 @@
                 <w:sz w:val="19"/>
                 <w:szCs w:val="19"/>
               </w:rPr>
-              <w:t xml:space="preserve">Menú / Torre / Inventario / VentanaPrincipal</w:t>
+              <w:t xml:space="preserve">PantallaMenu / PantallaInventario</w:t>
             </w:r>
           </w:p>
         </w:tc>
@@ -2641,65 +4054,7 @@
                 <w:sz w:val="19"/>
                 <w:szCs w:val="19"/>
               </w:rPr>
-              <w:t xml:space="preserve">Movidas al paquete vista. La Torre muestra los pisos de arriba (10) a abajo (1). Inventario sigue siendo maqueta.</w:t>
-            </w:r>
-          </w:p>
-        </w:tc>
-      </w:tr>
-      <w:tr>
-        <w:tc>
-          <w:tcPr>
-            <w:tcW w:type="dxa" w:w="2600"/>
-            <w:tcBorders>
-              <w:top w:val="single" w:color="C8CDD6" w:sz="4"/>
-              <w:left w:val="single" w:color="C8CDD6" w:sz="4"/>
-              <w:bottom w:val="single" w:color="C8CDD6" w:sz="4"/>
-              <w:right w:val="single" w:color="C8CDD6" w:sz="4"/>
-            </w:tcBorders>
-            <w:tcMar>
-              <w:top w:type="dxa" w:w="60"/>
-              <w:left w:type="dxa" w:w="100"/>
-              <w:bottom w:type="dxa" w:w="60"/>
-              <w:right w:type="dxa" w:w="100"/>
-            </w:tcMar>
-          </w:tcPr>
-          <w:p>
-            <w:r>
-              <w:rPr>
-                <w:b w:val="false"/>
-                <w:bCs w:val="false"/>
-                <w:sz w:val="19"/>
-                <w:szCs w:val="19"/>
-              </w:rPr>
-              <w:t xml:space="preserve">Esqueleto</w:t>
-            </w:r>
-          </w:p>
-        </w:tc>
-        <w:tc>
-          <w:tcPr>
-            <w:tcW w:type="dxa" w:w="6426"/>
-            <w:tcBorders>
-              <w:top w:val="single" w:color="C8CDD6" w:sz="4"/>
-              <w:left w:val="single" w:color="C8CDD6" w:sz="4"/>
-              <w:bottom w:val="single" w:color="C8CDD6" w:sz="4"/>
-              <w:right w:val="single" w:color="C8CDD6" w:sz="4"/>
-            </w:tcBorders>
-            <w:tcMar>
-              <w:top w:type="dxa" w:w="60"/>
-              <w:left w:type="dxa" w:w="100"/>
-              <w:bottom w:type="dxa" w:w="60"/>
-              <w:right w:type="dxa" w:w="100"/>
-            </w:tcMar>
-          </w:tcPr>
-          <w:p>
-            <w:r>
-              <w:rPr>
-                <w:b w:val="false"/>
-                <w:bCs w:val="false"/>
-                <w:sz w:val="19"/>
-                <w:szCs w:val="19"/>
-              </w:rPr>
-              <w:t xml:space="preserve">Movido a modelo.enemigos. No aparece en la Torre: hay que decidir si lo sumamos o lo borramos.</w:t>
+              <w:t xml:space="preserve">Botones según lo acordado. El Inventario vuelve al Resumen.</w:t>
             </w:r>
           </w:p>
         </w:tc>
@@ -2710,7 +4065,7 @@
         <w:pStyle w:val="Heading1"/>
       </w:pPr>
       <w:r>
-        <w:t xml:space="preserve">6. Bugs que arreglé</w:t>
+        <w:t xml:space="preserve">7. Bugs que arreglé</w:t>
       </w:r>
     </w:p>
     <w:p>
@@ -2730,7 +4085,7 @@
         <w:t xml:space="preserve">Defender eterno: </w:t>
       </w:r>
       <w:r>
-        <w:t xml:space="preserve">se apagaba recién con el primer golpe. Si al Guerrero no le pegaban, quedaba defendido para siempre. Ahora dura hasta que empieza su próximo turno (como dice el doc: "el daño que recibe ese turno").</w:t>
+        <w:t xml:space="preserve">si al Guerrero no le pegaban, quedaba defendido para siempre. Ahora dura hasta su próximo turno ("el daño que recibe ese turno").</w:t>
       </w:r>
     </w:p>
     <w:p>
@@ -2747,10 +4102,10 @@
           <w:b/>
           <w:bCs/>
         </w:rPr>
-        <w:t xml:space="preserve">Revivir no podía revivir: </w:t>
-      </w:r>
-      <w:r>
-        <w:t xml:space="preserve">el motor de consola solo ofrecía aliados VIVOS como objetivo. Ahora Revivir puede apuntar a caídos y Sanación no.</w:t>
+        <w:t xml:space="preserve">Maná que no se reseteaba: </w:t>
+      </w:r>
+      <w:r>
+        <w:t xml:space="preserve">ahora cada batalla arranca con 0 de maná y sin efectos de la anterior.</w:t>
       </w:r>
     </w:p>
     <w:p>
@@ -2767,10 +4122,10 @@
           <w:b/>
           <w:bCs/>
         </w:rPr>
-        <w:t xml:space="preserve">Sanación revivía: </w:t>
-      </w:r>
-      <w:r>
-        <w:t xml:space="preserve">curar 20 a alguien en 0 lo "revivía" más barato que Revivir. Ahora solo se usa sobre vivos.</w:t>
+        <w:t xml:space="preserve">Perder el turno por falta de maná: </w:t>
+      </w:r>
+      <w:r>
+        <w:t xml:space="preserve">ahora la habilidad aparece bloqueada y se elige otra cosa ("la habilidad se muestra bloqueada").</w:t>
       </w:r>
     </w:p>
     <w:p>
@@ -2787,10 +4142,10 @@
           <w:b/>
           <w:bCs/>
         </w:rPr>
-        <w:t xml:space="preserve">Maná que no se reseteaba: </w:t>
-      </w:r>
-      <w:r>
-        <w:t xml:space="preserve">arrancaba en 0 solo al crear el personaje. Con una party que pasa de piso, arrastraba maná y efectos. Ahora cada batalla arranca limpia.</w:t>
+        <w:t xml:space="preserve">Mensajes perdidos en Swing: </w:t>
+      </w:r>
+      <w:r>
+        <w:t xml:space="preserve">el modelo hacía System.out.println y en la ventana no se veía qué hacía el enemigo. Ahora todo llega al log.</w:t>
       </w:r>
     </w:p>
     <w:p>
@@ -2807,46 +4162,18 @@
           <w:b/>
           <w:bCs/>
         </w:rPr>
-        <w:t xml:space="preserve">Perder el turno por falta de maná: </w:t>
-      </w:r>
-      <w:r>
-        <w:t xml:space="preserve">si elegías una habilidad sin maná, perdías el turno. Ahora la habilidad aparece bloqueada y elegís otra cosa (doc: "la habilidad se muestra bloqueada").</w:t>
+        <w:t xml:space="preserve">Experiencia que no servía: </w:t>
+      </w:r>
+      <w:r>
+        <w:t xml:space="preserve">subirNivel() existía pero nadie lo llamaba, y cada batalla arrancaba con una party nueva. Ahora la party sube de nivel y se mantiene entre pisos.</w:t>
       </w:r>
     </w:p>
     <w:p>
       <w:pPr>
-        <w:pStyle w:val="ListParagraph"/>
-        <w:numPr>
-          <w:ilvl w:val="0"/>
-          <w:numId w:val="4"/>
-        </w:numPr>
-        <w:spacing w:after="80"/>
-      </w:pPr>
-      <w:r>
-        <w:rPr>
-          <w:b/>
-          <w:bCs/>
-        </w:rPr>
-        <w:t xml:space="preserve">Mensajes perdidos en Swing: </w:t>
-      </w:r>
-      <w:r>
-        <w:t xml:space="preserve">el modelo hacía System.out.println, así que en la ventana no se veía lo que hacía el enemigo. Ahora todo devuelve texto y la pantalla lo muestra en el log.</w:t>
-      </w:r>
-    </w:p>
-    <w:p>
-      <w:pPr>
-        <w:spacing w:after="120" w:before="80"/>
-      </w:pPr>
-      <w:r>
-        <w:t xml:space="preserve">De paso, la consola ya no explota si alguien escribe una letra en vez de un número.</w:t>
-      </w:r>
-    </w:p>
-    <w:p>
-      <w:pPr>
         <w:pStyle w:val="Heading1"/>
       </w:pPr>
       <w:r>
-        <w:t xml:space="preserve">7. Cómo lo probé</w:t>
+        <w:t xml:space="preserve">8. Cómo lo probé</w:t>
       </w:r>
     </w:p>
     <w:p>
@@ -2859,7 +4186,7 @@
         <w:spacing w:after="60"/>
       </w:pPr>
       <w:r>
-        <w:t xml:space="preserve">Compila entero con javac (solo quedan warnings estándar de Swing, ningún error).</w:t>
+        <w:t xml:space="preserve">Compila entero (sin errores).</w:t>
       </w:r>
     </w:p>
     <w:p>
@@ -2872,7 +4199,7 @@
         <w:spacing w:after="60"/>
       </w:pPr>
       <w:r>
-        <w:t xml:space="preserve">Pruebas puntuales: stats de nivel 1, límite de party, maná insuficiente, Defender, Revivir sobre caído (deja 25% = 7 de vida al Arquero), experiencia (350 exp → nivel 3 con 50 sobrantes), escalado (Slime piso 9 = 45 de vida / 22 de ataque).</w:t>
+        <w:t xml:space="preserve">Pruebas puntuales: stats de nivel 1, límite de party, maná insuficiente, Defender, Disparo Certero = (35 − 12) × 1,5 = 34, Sanación Mayor, experiencia y escalado.</w:t>
       </w:r>
     </w:p>
     <w:p>
@@ -2885,7 +4212,7 @@
         <w:spacing w:after="60"/>
       </w:pPr>
       <w:r>
-        <w:t xml:space="preserve">2000 batallas automáticas (pisos 1, 3, 5, 8 y 10, jugando al azar): ninguna excepción ni bucle infinito.</w:t>
+        <w:t xml:space="preserve">1000 partidas completas simuladas (piso 1 al 10): ninguna excepción ni bucle infinito.</w:t>
       </w:r>
     </w:p>
     <w:p>
@@ -2898,85 +4225,23 @@
         <w:spacing w:after="60"/>
       </w:pPr>
       <w:r>
-        <w:t xml:space="preserve">Batalla completa por consola y la ventana de Swing en el piso 5 con botones clickeados de verdad:</w:t>
+        <w:t xml:space="preserve">Una partida entera por consola y la ventana con botones clickeados de verdad (las capturas de la sección 4).</w:t>
       </w:r>
     </w:p>
     <w:p>
       <w:pPr>
-        <w:spacing w:after="60" w:before="120"/>
-        <w:jc w:val="center"/>
-      </w:pPr>
-      <w:r>
-        <w:drawing>
-          <wp:inline distT="0" distB="0" distL="0" distR="0">
-            <wp:extent cx="5334000" cy="3781425"/>
-            <wp:effectExtent t="0" r="0" b="0" l="0"/>
-            <wp:docPr id="1" name="" descr="" title=""/>
-            <wp:cNvGraphicFramePr>
-              <a:graphicFrameLocks xmlns:a="http://schemas.openxmlformats.org/drawingml/2006/main" noChangeAspect="1"/>
-            </wp:cNvGraphicFramePr>
-            <a:graphic xmlns:a="http://schemas.openxmlformats.org/drawingml/2006/main">
-              <a:graphicData uri="http://schemas.openxmlformats.org/drawingml/2006/picture">
-                <pic:pic xmlns:pic="http://schemas.openxmlformats.org/drawingml/2006/picture">
-                  <pic:nvPicPr>
-                    <pic:cNvPr id="0" name="" descr=""/>
-                    <pic:cNvPicPr>
-                      <a:picLocks noChangeAspect="1" noChangeArrowheads="1"/>
-                    </pic:cNvPicPr>
-                  </pic:nvPicPr>
-                  <pic:blipFill>
-                    <a:blip r:embed="rId8" cstate="none"/>
-                    <a:srcRect/>
-                    <a:stretch>
-                      <a:fillRect/>
-                    </a:stretch>
-                  </pic:blipFill>
-                  <pic:spPr bwMode="auto">
-                    <a:xfrm>
-                      <a:off x="0" y="0"/>
-                      <a:ext cx="5334000" cy="3781425"/>
-                    </a:xfrm>
-                    <a:prstGeom prst="rect">
-                      <a:avLst/>
-                    </a:prstGeom>
-                  </pic:spPr>
-                </pic:pic>
-              </a:graphicData>
-            </a:graphic>
-          </wp:inline>
-        </w:drawing>
+        <w:pStyle w:val="Heading1"/>
+      </w:pPr>
+      <w:r>
+        <w:t xml:space="preserve">9. Cosas que el documento no dice (hay que decidirlas)</w:t>
       </w:r>
     </w:p>
     <w:p>
       <w:pPr>
-        <w:spacing w:after="200"/>
-        <w:jc w:val="center"/>
-      </w:pPr>
-      <w:r>
-        <w:rPr>
-          <w:i/>
-          <w:iCs/>
-          <w:color w:val="666666"/>
-          <w:sz w:val="18"/>
-          <w:szCs w:val="18"/>
-        </w:rPr>
-        <w:t xml:space="preserve">Pantalla de Batalla contra el Rey Slime: la flechita al lado del nombre marca de quién es el turno según la Velocidad.</w:t>
-      </w:r>
-    </w:p>
-    <w:p>
-      <w:pPr>
-        <w:pStyle w:val="Heading1"/>
-      </w:pPr>
-      <w:r>
-        <w:t xml:space="preserve">8. Cosas que tenemos que decidir como grupo</w:t>
-      </w:r>
-    </w:p>
-    <w:p>
-      <w:pPr>
         <w:spacing w:after="120"/>
       </w:pPr>
       <w:r>
-        <w:t xml:space="preserve">El profe pide que los diagramas y el documento coincidan con el código. Hoy hay diferencias porque el grupo fue tomando decisiones después de entregar la Fase A. No toqué ninguna regla de juego: dejé el código como el grupo lo había decidido y anoté acá las diferencias para elegir una versión y alinear.</w:t>
+        <w:t xml:space="preserve">Tomé la opción más simple en cada caso y la dejé anotada. Si deciden otra cosa, se cambia en un solo lugar.</w:t>
       </w:r>
     </w:p>
     <w:tbl>
@@ -2992,9 +4257,9 @@
         </w:tblBorders>
       </w:tblPr>
       <w:tblGrid>
-        <w:gridCol w:w="2500"/>
-        <w:gridCol w:w="3100"/>
-        <w:gridCol w:w="3426"/>
+        <w:gridCol w:w="2400"/>
+        <w:gridCol w:w="3500"/>
+        <w:gridCol w:w="3126"/>
       </w:tblGrid>
       <w:tr>
         <w:trPr>
@@ -3002,7 +4267,7 @@
         </w:trPr>
         <w:tc>
           <w:tcPr>
-            <w:tcW w:type="dxa" w:w="2500"/>
+            <w:tcW w:type="dxa" w:w="2400"/>
             <w:tcBorders>
               <w:top w:val="single" w:color="C8CDD6" w:sz="4"/>
               <w:left w:val="single" w:color="C8CDD6" w:sz="4"/>
@@ -3032,7 +4297,7 @@
         </w:tc>
         <w:tc>
           <w:tcPr>
-            <w:tcW w:type="dxa" w:w="3100"/>
+            <w:tcW w:type="dxa" w:w="3500"/>
             <w:tcBorders>
               <w:top w:val="single" w:color="C8CDD6" w:sz="4"/>
               <w:left w:val="single" w:color="C8CDD6" w:sz="4"/>
@@ -3056,13 +4321,13 @@
                 <w:sz w:val="19"/>
                 <w:szCs w:val="19"/>
               </w:rPr>
-              <w:t xml:space="preserve">Documento entregado</w:t>
-            </w:r>
-          </w:p>
-        </w:tc>
-        <w:tc>
-          <w:tcPr>
-            <w:tcW w:type="dxa" w:w="3426"/>
+              <w:t xml:space="preserve">Qué hace hoy el código</w:t>
+            </w:r>
+          </w:p>
+        </w:tc>
+        <w:tc>
+          <w:tcPr>
+            <w:tcW w:type="dxa" w:w="3126"/>
             <w:tcBorders>
               <w:top w:val="single" w:color="C8CDD6" w:sz="4"/>
               <w:left w:val="single" w:color="C8CDD6" w:sz="4"/>
@@ -3086,7 +4351,7 @@
                 <w:sz w:val="19"/>
                 <w:szCs w:val="19"/>
               </w:rPr>
-              <w:t xml:space="preserve">Código hoy</w:t>
+              <w:t xml:space="preserve">Por qué importa</w:t>
             </w:r>
           </w:p>
         </w:tc>
@@ -3094,85 +4359,85 @@
       <w:tr>
         <w:tc>
           <w:tcPr>
-            <w:tcW w:type="dxa" w:w="2500"/>
-            <w:tcBorders>
-              <w:top w:val="single" w:color="C8CDD6" w:sz="4"/>
-              <w:left w:val="single" w:color="C8CDD6" w:sz="4"/>
-              <w:bottom w:val="single" w:color="C8CDD6" w:sz="4"/>
-              <w:right w:val="single" w:color="C8CDD6" w:sz="4"/>
-            </w:tcBorders>
-            <w:tcMar>
-              <w:top w:type="dxa" w:w="60"/>
-              <w:left w:type="dxa" w:w="100"/>
-              <w:bottom w:type="dxa" w:w="60"/>
-              <w:right w:type="dxa" w:w="100"/>
-            </w:tcMar>
-          </w:tcPr>
-          <w:p>
-            <w:r>
-              <w:rPr>
-                <w:b w:val="false"/>
-                <w:bCs w:val="false"/>
-                <w:sz w:val="19"/>
-                <w:szCs w:val="19"/>
-              </w:rPr>
-              <w:t xml:space="preserve">Habilidad poderosa del Curador</w:t>
-            </w:r>
-          </w:p>
-        </w:tc>
-        <w:tc>
-          <w:tcPr>
-            <w:tcW w:type="dxa" w:w="3100"/>
-            <w:tcBorders>
-              <w:top w:val="single" w:color="C8CDD6" w:sz="4"/>
-              <w:left w:val="single" w:color="C8CDD6" w:sz="4"/>
-              <w:bottom w:val="single" w:color="C8CDD6" w:sz="4"/>
-              <w:right w:val="single" w:color="C8CDD6" w:sz="4"/>
-            </w:tcBorders>
-            <w:tcMar>
-              <w:top w:type="dxa" w:w="60"/>
-              <w:left w:type="dxa" w:w="100"/>
-              <w:bottom w:type="dxa" w:w="60"/>
-              <w:right w:type="dxa" w:w="100"/>
-            </w:tcMar>
-          </w:tcPr>
-          <w:p>
-            <w:r>
-              <w:rPr>
-                <w:b w:val="false"/>
-                <w:bCs w:val="false"/>
-                <w:sz w:val="19"/>
-                <w:szCs w:val="19"/>
-              </w:rPr>
-              <w:t xml:space="preserve">Sanación Mayor (cura 45)</w:t>
-            </w:r>
-          </w:p>
-        </w:tc>
-        <w:tc>
-          <w:tcPr>
-            <w:tcW w:type="dxa" w:w="3426"/>
-            <w:tcBorders>
-              <w:top w:val="single" w:color="C8CDD6" w:sz="4"/>
-              <w:left w:val="single" w:color="C8CDD6" w:sz="4"/>
-              <w:bottom w:val="single" w:color="C8CDD6" w:sz="4"/>
-              <w:right w:val="single" w:color="C8CDD6" w:sz="4"/>
-            </w:tcBorders>
-            <w:tcMar>
-              <w:top w:type="dxa" w:w="60"/>
-              <w:left w:type="dxa" w:w="100"/>
-              <w:bottom w:type="dxa" w:w="60"/>
-              <w:right w:type="dxa" w:w="100"/>
-            </w:tcMar>
-          </w:tcPr>
-          <w:p>
-            <w:r>
-              <w:rPr>
-                <w:b w:val="false"/>
-                <w:bCs w:val="false"/>
-                <w:sz w:val="19"/>
-                <w:szCs w:val="19"/>
-              </w:rPr>
-              <w:t xml:space="preserve">Revivir (25% a un aliado / inmortal 2 turnos sobre sí)</w:t>
+            <w:tcW w:type="dxa" w:w="2400"/>
+            <w:tcBorders>
+              <w:top w:val="single" w:color="C8CDD6" w:sz="4"/>
+              <w:left w:val="single" w:color="C8CDD6" w:sz="4"/>
+              <w:bottom w:val="single" w:color="C8CDD6" w:sz="4"/>
+              <w:right w:val="single" w:color="C8CDD6" w:sz="4"/>
+            </w:tcBorders>
+            <w:tcMar>
+              <w:top w:type="dxa" w:w="60"/>
+              <w:left w:type="dxa" w:w="100"/>
+              <w:bottom w:type="dxa" w:w="60"/>
+              <w:right w:type="dxa" w:w="100"/>
+            </w:tcMar>
+          </w:tcPr>
+          <w:p>
+            <w:r>
+              <w:rPr>
+                <w:b w:val="false"/>
+                <w:bCs w:val="false"/>
+                <w:sz w:val="19"/>
+                <w:szCs w:val="19"/>
+              </w:rPr>
+              <w:t xml:space="preserve">¿Los jefes se escalan +10% por piso?</w:t>
+            </w:r>
+          </w:p>
+        </w:tc>
+        <w:tc>
+          <w:tcPr>
+            <w:tcW w:type="dxa" w:w="3500"/>
+            <w:tcBorders>
+              <w:top w:val="single" w:color="C8CDD6" w:sz="4"/>
+              <w:left w:val="single" w:color="C8CDD6" w:sz="4"/>
+              <w:bottom w:val="single" w:color="C8CDD6" w:sz="4"/>
+              <w:right w:val="single" w:color="C8CDD6" w:sz="4"/>
+            </w:tcBorders>
+            <w:tcMar>
+              <w:top w:type="dxa" w:w="60"/>
+              <w:left w:type="dxa" w:w="100"/>
+              <w:bottom w:type="dxa" w:w="60"/>
+              <w:right w:type="dxa" w:w="100"/>
+            </w:tcMar>
+          </w:tcPr>
+          <w:p>
+            <w:r>
+              <w:rPr>
+                <w:b w:val="false"/>
+                <w:bCs w:val="false"/>
+                <w:sz w:val="19"/>
+                <w:szCs w:val="19"/>
+              </w:rPr>
+              <w:t xml:space="preserve">NO. La tabla los marca como "Jefe (Piso 5)" y "Jefe Final (Piso 10)": sus números ya son los de su piso.</w:t>
+            </w:r>
+          </w:p>
+        </w:tc>
+        <w:tc>
+          <w:tcPr>
+            <w:tcW w:type="dxa" w:w="3126"/>
+            <w:tcBorders>
+              <w:top w:val="single" w:color="C8CDD6" w:sz="4"/>
+              <w:left w:val="single" w:color="C8CDD6" w:sz="4"/>
+              <w:bottom w:val="single" w:color="C8CDD6" w:sz="4"/>
+              <w:right w:val="single" w:color="C8CDD6" w:sz="4"/>
+            </w:tcBorders>
+            <w:tcMar>
+              <w:top w:type="dxa" w:w="60"/>
+              <w:left w:type="dxa" w:w="100"/>
+              <w:bottom w:type="dxa" w:w="60"/>
+              <w:right w:type="dxa" w:w="100"/>
+            </w:tcMar>
+          </w:tcPr>
+          <w:p>
+            <w:r>
+              <w:rPr>
+                <w:b w:val="false"/>
+                <w:bCs w:val="false"/>
+                <w:sz w:val="19"/>
+                <w:szCs w:val="19"/>
+              </w:rPr>
+              <w:t xml:space="preserve">Si se escalan, el Guardián queda con 57 de defensa: 0 victorias en 1000 partidas simuladas.</w:t>
             </w:r>
           </w:p>
         </w:tc>
@@ -3180,85 +4445,85 @@
       <w:tr>
         <w:tc>
           <w:tcPr>
-            <w:tcW w:type="dxa" w:w="2500"/>
-            <w:tcBorders>
-              <w:top w:val="single" w:color="C8CDD6" w:sz="4"/>
-              <w:left w:val="single" w:color="C8CDD6" w:sz="4"/>
-              <w:bottom w:val="single" w:color="C8CDD6" w:sz="4"/>
-              <w:right w:val="single" w:color="C8CDD6" w:sz="4"/>
-            </w:tcBorders>
-            <w:tcMar>
-              <w:top w:type="dxa" w:w="60"/>
-              <w:left w:type="dxa" w:w="100"/>
-              <w:bottom w:type="dxa" w:w="60"/>
-              <w:right w:type="dxa" w:w="100"/>
-            </w:tcMar>
-          </w:tcPr>
-          <w:p>
-            <w:r>
-              <w:rPr>
-                <w:b w:val="false"/>
-                <w:bCs w:val="false"/>
-                <w:sz w:val="19"/>
-                <w:szCs w:val="19"/>
-              </w:rPr>
-              <w:t xml:space="preserve">Disparo Certero (Arquero)</w:t>
-            </w:r>
-          </w:p>
-        </w:tc>
-        <w:tc>
-          <w:tcPr>
-            <w:tcW w:type="dxa" w:w="3100"/>
-            <w:tcBorders>
-              <w:top w:val="single" w:color="C8CDD6" w:sz="4"/>
-              <w:left w:val="single" w:color="C8CDD6" w:sz="4"/>
-              <w:bottom w:val="single" w:color="C8CDD6" w:sz="4"/>
-              <w:right w:val="single" w:color="C8CDD6" w:sz="4"/>
-            </w:tcBorders>
-            <w:tcMar>
-              <w:top w:type="dxa" w:w="60"/>
-              <w:left w:type="dxa" w:w="100"/>
-              <w:bottom w:type="dxa" w:w="60"/>
-              <w:right w:type="dxa" w:w="100"/>
-            </w:tcMar>
-          </w:tcPr>
-          <w:p>
-            <w:r>
-              <w:rPr>
-                <w:b w:val="false"/>
-                <w:bCs w:val="false"/>
-                <w:sz w:val="19"/>
-                <w:szCs w:val="19"/>
-              </w:rPr>
-              <w:t xml:space="preserve">Daño físico x1.5</w:t>
-            </w:r>
-          </w:p>
-        </w:tc>
-        <w:tc>
-          <w:tcPr>
-            <w:tcW w:type="dxa" w:w="3426"/>
-            <w:tcBorders>
-              <w:top w:val="single" w:color="C8CDD6" w:sz="4"/>
-              <w:left w:val="single" w:color="C8CDD6" w:sz="4"/>
-              <w:bottom w:val="single" w:color="C8CDD6" w:sz="4"/>
-              <w:right w:val="single" w:color="C8CDD6" w:sz="4"/>
-            </w:tcBorders>
-            <w:tcMar>
-              <w:top w:type="dxa" w:w="60"/>
-              <w:left w:type="dxa" w:w="100"/>
-              <w:bottom w:type="dxa" w:w="60"/>
-              <w:right w:type="dxa" w:w="100"/>
-            </w:tcMar>
-          </w:tcPr>
-          <w:p>
-            <w:r>
-              <w:rPr>
-                <w:b w:val="false"/>
-                <w:bCs w:val="false"/>
-                <w:sz w:val="19"/>
-                <w:szCs w:val="19"/>
-              </w:rPr>
-              <w:t xml:space="preserve">40% de crítico con daño x2</w:t>
+            <w:tcW w:type="dxa" w:w="2400"/>
+            <w:tcBorders>
+              <w:top w:val="single" w:color="C8CDD6" w:sz="4"/>
+              <w:left w:val="single" w:color="C8CDD6" w:sz="4"/>
+              <w:bottom w:val="single" w:color="C8CDD6" w:sz="4"/>
+              <w:right w:val="single" w:color="C8CDD6" w:sz="4"/>
+            </w:tcBorders>
+            <w:tcMar>
+              <w:top w:type="dxa" w:w="60"/>
+              <w:left w:type="dxa" w:w="100"/>
+              <w:bottom w:type="dxa" w:w="60"/>
+              <w:right w:type="dxa" w:w="100"/>
+            </w:tcMar>
+          </w:tcPr>
+          <w:p>
+            <w:r>
+              <w:rPr>
+                <w:b w:val="false"/>
+                <w:bCs w:val="false"/>
+                <w:sz w:val="19"/>
+                <w:szCs w:val="19"/>
+              </w:rPr>
+              <w:t xml:space="preserve">Balance general</w:t>
+            </w:r>
+          </w:p>
+        </w:tc>
+        <w:tc>
+          <w:tcPr>
+            <w:tcW w:type="dxa" w:w="3500"/>
+            <w:tcBorders>
+              <w:top w:val="single" w:color="C8CDD6" w:sz="4"/>
+              <w:left w:val="single" w:color="C8CDD6" w:sz="4"/>
+              <w:bottom w:val="single" w:color="C8CDD6" w:sz="4"/>
+              <w:right w:val="single" w:color="C8CDD6" w:sz="4"/>
+            </w:tcBorders>
+            <w:tcMar>
+              <w:top w:type="dxa" w:w="60"/>
+              <w:left w:type="dxa" w:w="100"/>
+              <w:bottom w:type="dxa" w:w="60"/>
+              <w:right w:type="dxa" w:w="100"/>
+            </w:tcMar>
+          </w:tcPr>
+          <w:p>
+            <w:r>
+              <w:rPr>
+                <w:b w:val="false"/>
+                <w:bCs w:val="false"/>
+                <w:sz w:val="19"/>
+                <w:szCs w:val="19"/>
+              </w:rPr>
+              <w:t xml:space="preserve">Con los números del documento se ganan 1000 de 1000 partidas. La party llega al piso 10 en nivel 3-4 y le gana al Guardián en ~6 rondas, aun atacando nomás.</w:t>
+            </w:r>
+          </w:p>
+        </w:tc>
+        <w:tc>
+          <w:tcPr>
+            <w:tcW w:type="dxa" w:w="3126"/>
+            <w:tcBorders>
+              <w:top w:val="single" w:color="C8CDD6" w:sz="4"/>
+              <w:left w:val="single" w:color="C8CDD6" w:sz="4"/>
+              <w:bottom w:val="single" w:color="C8CDD6" w:sz="4"/>
+              <w:right w:val="single" w:color="C8CDD6" w:sz="4"/>
+            </w:tcBorders>
+            <w:tcMar>
+              <w:top w:type="dxa" w:w="60"/>
+              <w:left w:type="dxa" w:w="100"/>
+              <w:bottom w:type="dxa" w:w="60"/>
+              <w:right w:type="dxa" w:w="100"/>
+            </w:tcMar>
+          </w:tcPr>
+          <w:p>
+            <w:r>
+              <w:rPr>
+                <w:b w:val="false"/>
+                <w:bCs w:val="false"/>
+                <w:sz w:val="19"/>
+                <w:szCs w:val="19"/>
+              </w:rPr>
+              <w:t xml:space="preserve">Es MUY fácil. Si quieren más dificultad, hay que cambiar los números en el documento primero.</w:t>
             </w:r>
           </w:p>
         </w:tc>
@@ -3266,85 +4531,85 @@
       <w:tr>
         <w:tc>
           <w:tcPr>
-            <w:tcW w:type="dxa" w:w="2500"/>
-            <w:tcBorders>
-              <w:top w:val="single" w:color="C8CDD6" w:sz="4"/>
-              <w:left w:val="single" w:color="C8CDD6" w:sz="4"/>
-              <w:bottom w:val="single" w:color="C8CDD6" w:sz="4"/>
-              <w:right w:val="single" w:color="C8CDD6" w:sz="4"/>
-            </w:tcBorders>
-            <w:tcMar>
-              <w:top w:type="dxa" w:w="60"/>
-              <w:left w:type="dxa" w:w="100"/>
-              <w:bottom w:type="dxa" w:w="60"/>
-              <w:right w:type="dxa" w:w="100"/>
-            </w:tcMar>
-          </w:tcPr>
-          <w:p>
-            <w:r>
-              <w:rPr>
-                <w:b w:val="false"/>
-                <w:bCs w:val="false"/>
-                <w:sz w:val="19"/>
-                <w:szCs w:val="19"/>
-              </w:rPr>
-              <w:t xml:space="preserve">Slime</w:t>
-            </w:r>
-          </w:p>
-        </w:tc>
-        <w:tc>
-          <w:tcPr>
-            <w:tcW w:type="dxa" w:w="3100"/>
-            <w:tcBorders>
-              <w:top w:val="single" w:color="C8CDD6" w:sz="4"/>
-              <w:left w:val="single" w:color="C8CDD6" w:sz="4"/>
-              <w:bottom w:val="single" w:color="C8CDD6" w:sz="4"/>
-              <w:right w:val="single" w:color="C8CDD6" w:sz="4"/>
-            </w:tcBorders>
-            <w:tcMar>
-              <w:top w:type="dxa" w:w="60"/>
-              <w:left w:type="dxa" w:w="100"/>
-              <w:bottom w:type="dxa" w:w="60"/>
-              <w:right w:type="dxa" w:w="100"/>
-            </w:tcMar>
-          </w:tcPr>
-          <w:p>
-            <w:r>
-              <w:rPr>
-                <w:b w:val="false"/>
-                <w:bCs w:val="false"/>
-                <w:sz w:val="19"/>
-                <w:szCs w:val="19"/>
-              </w:rPr>
-              <w:t xml:space="preserve">Solo ataca</w:t>
-            </w:r>
-          </w:p>
-        </w:tc>
-        <w:tc>
-          <w:tcPr>
-            <w:tcW w:type="dxa" w:w="3426"/>
-            <w:tcBorders>
-              <w:top w:val="single" w:color="C8CDD6" w:sz="4"/>
-              <w:left w:val="single" w:color="C8CDD6" w:sz="4"/>
-              <w:bottom w:val="single" w:color="C8CDD6" w:sz="4"/>
-              <w:right w:val="single" w:color="C8CDD6" w:sz="4"/>
-            </w:tcBorders>
-            <w:tcMar>
-              <w:top w:type="dxa" w:w="60"/>
-              <w:left w:type="dxa" w:w="100"/>
-              <w:bottom w:type="dxa" w:w="60"/>
-              <w:right w:type="dxa" w:w="100"/>
-            </w:tcMar>
-          </w:tcPr>
-          <w:p>
-            <w:r>
-              <w:rPr>
-                <w:b w:val="false"/>
-                <w:bCs w:val="false"/>
-                <w:sz w:val="19"/>
-                <w:szCs w:val="19"/>
-              </w:rPr>
-              <w:t xml:space="preserve">70% ataca / 30% Escupitajo</w:t>
+            <w:tcW w:type="dxa" w:w="2400"/>
+            <w:tcBorders>
+              <w:top w:val="single" w:color="C8CDD6" w:sz="4"/>
+              <w:left w:val="single" w:color="C8CDD6" w:sz="4"/>
+              <w:bottom w:val="single" w:color="C8CDD6" w:sz="4"/>
+              <w:right w:val="single" w:color="C8CDD6" w:sz="4"/>
+            </w:tcBorders>
+            <w:tcMar>
+              <w:top w:type="dxa" w:w="60"/>
+              <w:left w:type="dxa" w:w="100"/>
+              <w:bottom w:type="dxa" w:w="60"/>
+              <w:right w:type="dxa" w:w="100"/>
+            </w:tcMar>
+          </w:tcPr>
+          <w:p>
+            <w:r>
+              <w:rPr>
+                <w:b w:val="false"/>
+                <w:bCs w:val="false"/>
+                <w:sz w:val="19"/>
+                <w:szCs w:val="19"/>
+              </w:rPr>
+              <w:t xml:space="preserve">¿Se recupera vida entre pisos?</w:t>
+            </w:r>
+          </w:p>
+        </w:tc>
+        <w:tc>
+          <w:tcPr>
+            <w:tcW w:type="dxa" w:w="3500"/>
+            <w:tcBorders>
+              <w:top w:val="single" w:color="C8CDD6" w:sz="4"/>
+              <w:left w:val="single" w:color="C8CDD6" w:sz="4"/>
+              <w:bottom w:val="single" w:color="C8CDD6" w:sz="4"/>
+              <w:right w:val="single" w:color="C8CDD6" w:sz="4"/>
+            </w:tcBorders>
+            <w:tcMar>
+              <w:top w:type="dxa" w:w="60"/>
+              <w:left w:type="dxa" w:w="100"/>
+              <w:bottom w:type="dxa" w:w="60"/>
+              <w:right w:type="dxa" w:w="100"/>
+            </w:tcMar>
+          </w:tcPr>
+          <w:p>
+            <w:r>
+              <w:rPr>
+                <w:b w:val="false"/>
+                <w:bCs w:val="false"/>
+                <w:sz w:val="19"/>
+                <w:szCs w:val="19"/>
+              </w:rPr>
+              <w:t xml:space="preserve">NO, la vida se arrastra.</w:t>
+            </w:r>
+          </w:p>
+        </w:tc>
+        <w:tc>
+          <w:tcPr>
+            <w:tcW w:type="dxa" w:w="3126"/>
+            <w:tcBorders>
+              <w:top w:val="single" w:color="C8CDD6" w:sz="4"/>
+              <w:left w:val="single" w:color="C8CDD6" w:sz="4"/>
+              <w:bottom w:val="single" w:color="C8CDD6" w:sz="4"/>
+              <w:right w:val="single" w:color="C8CDD6" w:sz="4"/>
+            </w:tcBorders>
+            <w:tcMar>
+              <w:top w:type="dxa" w:w="60"/>
+              <w:left w:type="dxa" w:w="100"/>
+              <w:bottom w:type="dxa" w:w="60"/>
+              <w:right w:type="dxa" w:w="100"/>
+            </w:tcMar>
+          </w:tcPr>
+          <w:p>
+            <w:r>
+              <w:rPr>
+                <w:b w:val="false"/>
+                <w:bCs w:val="false"/>
+                <w:sz w:val="19"/>
+                <w:szCs w:val="19"/>
+              </w:rPr>
+              <w:t xml:space="preserve">Sin habilidad que reviva, un personaje caído queda caído para siempre. Conviene decidirlo junto con las pociones.</w:t>
             </w:r>
           </w:p>
         </w:tc>
@@ -3352,85 +4617,85 @@
       <w:tr>
         <w:tc>
           <w:tcPr>
-            <w:tcW w:type="dxa" w:w="2500"/>
-            <w:tcBorders>
-              <w:top w:val="single" w:color="C8CDD6" w:sz="4"/>
-              <w:left w:val="single" w:color="C8CDD6" w:sz="4"/>
-              <w:bottom w:val="single" w:color="C8CDD6" w:sz="4"/>
-              <w:right w:val="single" w:color="C8CDD6" w:sz="4"/>
-            </w:tcBorders>
-            <w:tcMar>
-              <w:top w:type="dxa" w:w="60"/>
-              <w:left w:type="dxa" w:w="100"/>
-              <w:bottom w:type="dxa" w:w="60"/>
-              <w:right w:type="dxa" w:w="100"/>
-            </w:tcMar>
-          </w:tcPr>
-          <w:p>
-            <w:r>
-              <w:rPr>
-                <w:b w:val="false"/>
-                <w:bCs w:val="false"/>
-                <w:sz w:val="19"/>
-                <w:szCs w:val="19"/>
-              </w:rPr>
-              <w:t xml:space="preserve">Goblin</w:t>
-            </w:r>
-          </w:p>
-        </w:tc>
-        <w:tc>
-          <w:tcPr>
-            <w:tcW w:type="dxa" w:w="3100"/>
-            <w:tcBorders>
-              <w:top w:val="single" w:color="C8CDD6" w:sz="4"/>
-              <w:left w:val="single" w:color="C8CDD6" w:sz="4"/>
-              <w:bottom w:val="single" w:color="C8CDD6" w:sz="4"/>
-              <w:right w:val="single" w:color="C8CDD6" w:sz="4"/>
-            </w:tcBorders>
-            <w:tcMar>
-              <w:top w:type="dxa" w:w="60"/>
-              <w:left w:type="dxa" w:w="100"/>
-              <w:bottom w:type="dxa" w:w="60"/>
-              <w:right w:type="dxa" w:w="100"/>
-            </w:tcMar>
-          </w:tcPr>
-          <w:p>
-            <w:r>
-              <w:rPr>
-                <w:b w:val="false"/>
-                <w:bCs w:val="false"/>
-                <w:sz w:val="19"/>
-                <w:szCs w:val="19"/>
-              </w:rPr>
-              <w:t xml:space="preserve">70% ataca / 30% aturde</w:t>
-            </w:r>
-          </w:p>
-        </w:tc>
-        <w:tc>
-          <w:tcPr>
-            <w:tcW w:type="dxa" w:w="3426"/>
-            <w:tcBorders>
-              <w:top w:val="single" w:color="C8CDD6" w:sz="4"/>
-              <w:left w:val="single" w:color="C8CDD6" w:sz="4"/>
-              <w:bottom w:val="single" w:color="C8CDD6" w:sz="4"/>
-              <w:right w:val="single" w:color="C8CDD6" w:sz="4"/>
-            </w:tcBorders>
-            <w:tcMar>
-              <w:top w:type="dxa" w:w="60"/>
-              <w:left w:type="dxa" w:w="100"/>
-              <w:bottom w:type="dxa" w:w="60"/>
-              <w:right w:type="dxa" w:w="100"/>
-            </w:tcMar>
-          </w:tcPr>
-          <w:p>
-            <w:r>
-              <w:rPr>
-                <w:b w:val="false"/>
-                <w:bCs w:val="false"/>
-                <w:sz w:val="19"/>
-                <w:szCs w:val="19"/>
-              </w:rPr>
-              <w:t xml:space="preserve">50 / 30 / 20 con Golpe Debilitante</w:t>
+            <w:tcW w:type="dxa" w:w="2400"/>
+            <w:tcBorders>
+              <w:top w:val="single" w:color="C8CDD6" w:sz="4"/>
+              <w:left w:val="single" w:color="C8CDD6" w:sz="4"/>
+              <w:bottom w:val="single" w:color="C8CDD6" w:sz="4"/>
+              <w:right w:val="single" w:color="C8CDD6" w:sz="4"/>
+            </w:tcBorders>
+            <w:tcMar>
+              <w:top w:type="dxa" w:w="60"/>
+              <w:left w:type="dxa" w:w="100"/>
+              <w:bottom w:type="dxa" w:w="60"/>
+              <w:right w:type="dxa" w:w="100"/>
+            </w:tcMar>
+          </w:tcPr>
+          <w:p>
+            <w:r>
+              <w:rPr>
+                <w:b w:val="false"/>
+                <w:bCs w:val="false"/>
+                <w:sz w:val="19"/>
+                <w:szCs w:val="19"/>
+              </w:rPr>
+              <w:t xml:space="preserve">¿Subir de nivel cura del todo?</w:t>
+            </w:r>
+          </w:p>
+        </w:tc>
+        <w:tc>
+          <w:tcPr>
+            <w:tcW w:type="dxa" w:w="3500"/>
+            <w:tcBorders>
+              <w:top w:val="single" w:color="C8CDD6" w:sz="4"/>
+              <w:left w:val="single" w:color="C8CDD6" w:sz="4"/>
+              <w:bottom w:val="single" w:color="C8CDD6" w:sz="4"/>
+              <w:right w:val="single" w:color="C8CDD6" w:sz="4"/>
+            </w:tcBorders>
+            <w:tcMar>
+              <w:top w:type="dxa" w:w="60"/>
+              <w:left w:type="dxa" w:w="100"/>
+              <w:bottom w:type="dxa" w:w="60"/>
+              <w:right w:type="dxa" w:w="100"/>
+            </w:tcMar>
+          </w:tcPr>
+          <w:p>
+            <w:r>
+              <w:rPr>
+                <w:b w:val="false"/>
+                <w:bCs w:val="false"/>
+                <w:sz w:val="19"/>
+                <w:szCs w:val="19"/>
+              </w:rPr>
+              <w:t xml:space="preserve">SÍ.</w:t>
+            </w:r>
+          </w:p>
+        </w:tc>
+        <w:tc>
+          <w:tcPr>
+            <w:tcW w:type="dxa" w:w="3126"/>
+            <w:tcBorders>
+              <w:top w:val="single" w:color="C8CDD6" w:sz="4"/>
+              <w:left w:val="single" w:color="C8CDD6" w:sz="4"/>
+              <w:bottom w:val="single" w:color="C8CDD6" w:sz="4"/>
+              <w:right w:val="single" w:color="C8CDD6" w:sz="4"/>
+            </w:tcBorders>
+            <w:tcMar>
+              <w:top w:type="dxa" w:w="60"/>
+              <w:left w:type="dxa" w:w="100"/>
+              <w:bottom w:type="dxa" w:w="60"/>
+              <w:right w:type="dxa" w:w="100"/>
+            </w:tcMar>
+          </w:tcPr>
+          <w:p>
+            <w:r>
+              <w:rPr>
+                <w:b w:val="false"/>
+                <w:bCs w:val="false"/>
+                <w:sz w:val="19"/>
+                <w:szCs w:val="19"/>
+              </w:rPr>
+              <w:t xml:space="preserve">Hoy es la única forma de recuperar vida entre pisos.</w:t>
             </w:r>
           </w:p>
         </w:tc>
@@ -3438,85 +4703,85 @@
       <w:tr>
         <w:tc>
           <w:tcPr>
-            <w:tcW w:type="dxa" w:w="2500"/>
-            <w:tcBorders>
-              <w:top w:val="single" w:color="C8CDD6" w:sz="4"/>
-              <w:left w:val="single" w:color="C8CDD6" w:sz="4"/>
-              <w:bottom w:val="single" w:color="C8CDD6" w:sz="4"/>
-              <w:right w:val="single" w:color="C8CDD6" w:sz="4"/>
-            </w:tcBorders>
-            <w:tcMar>
-              <w:top w:type="dxa" w:w="60"/>
-              <w:left w:type="dxa" w:w="100"/>
-              <w:bottom w:type="dxa" w:w="60"/>
-              <w:right w:type="dxa" w:w="100"/>
-            </w:tcMar>
-          </w:tcPr>
-          <w:p>
-            <w:r>
-              <w:rPr>
-                <w:b w:val="false"/>
-                <w:bCs w:val="false"/>
-                <w:sz w:val="19"/>
-                <w:szCs w:val="19"/>
-              </w:rPr>
-              <w:t xml:space="preserve">Rey Slime (piso 5)</w:t>
-            </w:r>
-          </w:p>
-        </w:tc>
-        <w:tc>
-          <w:tcPr>
-            <w:tcW w:type="dxa" w:w="3100"/>
-            <w:tcBorders>
-              <w:top w:val="single" w:color="C8CDD6" w:sz="4"/>
-              <w:left w:val="single" w:color="C8CDD6" w:sz="4"/>
-              <w:bottom w:val="single" w:color="C8CDD6" w:sz="4"/>
-              <w:right w:val="single" w:color="C8CDD6" w:sz="4"/>
-            </w:tcBorders>
-            <w:tcMar>
-              <w:top w:type="dxa" w:w="60"/>
-              <w:left w:type="dxa" w:w="100"/>
-              <w:bottom w:type="dxa" w:w="60"/>
-              <w:right w:type="dxa" w:w="100"/>
-            </w:tcMar>
-          </w:tcPr>
-          <w:p>
-            <w:r>
-              <w:rPr>
-                <w:b w:val="false"/>
-                <w:bCs w:val="false"/>
-                <w:sz w:val="19"/>
-                <w:szCs w:val="19"/>
-              </w:rPr>
-              <w:t xml:space="preserve">Vida 70, Atq 30, Def 20, Vel 25</w:t>
-            </w:r>
-          </w:p>
-        </w:tc>
-        <w:tc>
-          <w:tcPr>
-            <w:tcW w:type="dxa" w:w="3426"/>
-            <w:tcBorders>
-              <w:top w:val="single" w:color="C8CDD6" w:sz="4"/>
-              <w:left w:val="single" w:color="C8CDD6" w:sz="4"/>
-              <w:bottom w:val="single" w:color="C8CDD6" w:sz="4"/>
-              <w:right w:val="single" w:color="C8CDD6" w:sz="4"/>
-            </w:tcBorders>
-            <w:tcMar>
-              <w:top w:type="dxa" w:w="60"/>
-              <w:left w:type="dxa" w:w="100"/>
-              <w:bottom w:type="dxa" w:w="60"/>
-              <w:right w:type="dxa" w:w="100"/>
-            </w:tcMar>
-          </w:tcPr>
-          <w:p>
-            <w:r>
-              <w:rPr>
-                <w:b w:val="false"/>
-                <w:bCs w:val="false"/>
-                <w:sz w:val="19"/>
-                <w:szCs w:val="19"/>
-              </w:rPr>
-              <w:t xml:space="preserve">Vida 200, Atq 55, Def 25, Vel 30</w:t>
+            <w:tcW w:type="dxa" w:w="2400"/>
+            <w:tcBorders>
+              <w:top w:val="single" w:color="C8CDD6" w:sz="4"/>
+              <w:left w:val="single" w:color="C8CDD6" w:sz="4"/>
+              <w:bottom w:val="single" w:color="C8CDD6" w:sz="4"/>
+              <w:right w:val="single" w:color="C8CDD6" w:sz="4"/>
+            </w:tcBorders>
+            <w:tcMar>
+              <w:top w:type="dxa" w:w="60"/>
+              <w:left w:type="dxa" w:w="100"/>
+              <w:bottom w:type="dxa" w:w="60"/>
+              <w:right w:type="dxa" w:w="100"/>
+            </w:tcMar>
+          </w:tcPr>
+          <w:p>
+            <w:r>
+              <w:rPr>
+                <w:b w:val="false"/>
+                <w:bCs w:val="false"/>
+                <w:sz w:val="19"/>
+                <w:szCs w:val="19"/>
+              </w:rPr>
+              <w:t xml:space="preserve">Experiencia por enemigo</w:t>
+            </w:r>
+          </w:p>
+        </w:tc>
+        <w:tc>
+          <w:tcPr>
+            <w:tcW w:type="dxa" w:w="3500"/>
+            <w:tcBorders>
+              <w:top w:val="single" w:color="C8CDD6" w:sz="4"/>
+              <w:left w:val="single" w:color="C8CDD6" w:sz="4"/>
+              <w:bottom w:val="single" w:color="C8CDD6" w:sz="4"/>
+              <w:right w:val="single" w:color="C8CDD6" w:sz="4"/>
+            </w:tcBorders>
+            <w:tcMar>
+              <w:top w:type="dxa" w:w="60"/>
+              <w:left w:type="dxa" w:w="100"/>
+              <w:bottom w:type="dxa" w:w="60"/>
+              <w:right w:type="dxa" w:w="100"/>
+            </w:tcMar>
+          </w:tcPr>
+          <w:p>
+            <w:r>
+              <w:rPr>
+                <w:b w:val="false"/>
+                <w:bCs w:val="false"/>
+                <w:sz w:val="19"/>
+                <w:szCs w:val="19"/>
+              </w:rPr>
+              <w:t xml:space="preserve">Slime 30, Goblin 50, Rey Slime 250, Guardián 500.</w:t>
+            </w:r>
+          </w:p>
+        </w:tc>
+        <w:tc>
+          <w:tcPr>
+            <w:tcW w:type="dxa" w:w="3126"/>
+            <w:tcBorders>
+              <w:top w:val="single" w:color="C8CDD6" w:sz="4"/>
+              <w:left w:val="single" w:color="C8CDD6" w:sz="4"/>
+              <w:bottom w:val="single" w:color="C8CDD6" w:sz="4"/>
+              <w:right w:val="single" w:color="C8CDD6" w:sz="4"/>
+            </w:tcBorders>
+            <w:tcMar>
+              <w:top w:type="dxa" w:w="60"/>
+              <w:left w:type="dxa" w:w="100"/>
+              <w:bottom w:type="dxa" w:w="60"/>
+              <w:right w:type="dxa" w:w="100"/>
+            </w:tcMar>
+          </w:tcPr>
+          <w:p>
+            <w:r>
+              <w:rPr>
+                <w:b w:val="false"/>
+                <w:bCs w:val="false"/>
+                <w:sz w:val="19"/>
+                <w:szCs w:val="19"/>
+              </w:rPr>
+              <w:t xml:space="preserve">El documento dice "fija por tipo" pero no da números.</w:t>
             </w:r>
           </w:p>
         </w:tc>
@@ -3524,257 +4789,85 @@
       <w:tr>
         <w:tc>
           <w:tcPr>
-            <w:tcW w:type="dxa" w:w="2500"/>
-            <w:tcBorders>
-              <w:top w:val="single" w:color="C8CDD6" w:sz="4"/>
-              <w:left w:val="single" w:color="C8CDD6" w:sz="4"/>
-              <w:bottom w:val="single" w:color="C8CDD6" w:sz="4"/>
-              <w:right w:val="single" w:color="C8CDD6" w:sz="4"/>
-            </w:tcBorders>
-            <w:tcMar>
-              <w:top w:type="dxa" w:w="60"/>
-              <w:left w:type="dxa" w:w="100"/>
-              <w:bottom w:type="dxa" w:w="60"/>
-              <w:right w:type="dxa" w:w="100"/>
-            </w:tcMar>
-          </w:tcPr>
-          <w:p>
-            <w:r>
-              <w:rPr>
-                <w:b w:val="false"/>
-                <w:bCs w:val="false"/>
-                <w:sz w:val="19"/>
-                <w:szCs w:val="19"/>
-              </w:rPr>
-              <w:t xml:space="preserve">Guardián Ancestral (piso 10)</w:t>
-            </w:r>
-          </w:p>
-        </w:tc>
-        <w:tc>
-          <w:tcPr>
-            <w:tcW w:type="dxa" w:w="3100"/>
-            <w:tcBorders>
-              <w:top w:val="single" w:color="C8CDD6" w:sz="4"/>
-              <w:left w:val="single" w:color="C8CDD6" w:sz="4"/>
-              <w:bottom w:val="single" w:color="C8CDD6" w:sz="4"/>
-              <w:right w:val="single" w:color="C8CDD6" w:sz="4"/>
-            </w:tcBorders>
-            <w:tcMar>
-              <w:top w:type="dxa" w:w="60"/>
-              <w:left w:type="dxa" w:w="100"/>
-              <w:bottom w:type="dxa" w:w="60"/>
-              <w:right w:type="dxa" w:w="100"/>
-            </w:tcMar>
-          </w:tcPr>
-          <w:p>
-            <w:r>
-              <w:rPr>
-                <w:b w:val="false"/>
-                <w:bCs w:val="false"/>
-                <w:sz w:val="19"/>
-                <w:szCs w:val="19"/>
-              </w:rPr>
-              <w:t xml:space="preserve">Vida 120, Atq 45, Def 30, Vel 35</w:t>
-            </w:r>
-          </w:p>
-        </w:tc>
-        <w:tc>
-          <w:tcPr>
-            <w:tcW w:type="dxa" w:w="3426"/>
-            <w:tcBorders>
-              <w:top w:val="single" w:color="C8CDD6" w:sz="4"/>
-              <w:left w:val="single" w:color="C8CDD6" w:sz="4"/>
-              <w:bottom w:val="single" w:color="C8CDD6" w:sz="4"/>
-              <w:right w:val="single" w:color="C8CDD6" w:sz="4"/>
-            </w:tcBorders>
-            <w:tcMar>
-              <w:top w:type="dxa" w:w="60"/>
-              <w:left w:type="dxa" w:w="100"/>
-              <w:bottom w:type="dxa" w:w="60"/>
-              <w:right w:type="dxa" w:w="100"/>
-            </w:tcMar>
-          </w:tcPr>
-          <w:p>
-            <w:r>
-              <w:rPr>
-                <w:b w:val="false"/>
-                <w:bCs w:val="false"/>
-                <w:sz w:val="19"/>
-                <w:szCs w:val="19"/>
-              </w:rPr>
-              <w:t xml:space="preserve">Vida 220, Atq 56, Def 25, Vel 32</w:t>
-            </w:r>
-          </w:p>
-        </w:tc>
-      </w:tr>
-      <w:tr>
-        <w:tc>
-          <w:tcPr>
-            <w:tcW w:type="dxa" w:w="2500"/>
-            <w:tcBorders>
-              <w:top w:val="single" w:color="C8CDD6" w:sz="4"/>
-              <w:left w:val="single" w:color="C8CDD6" w:sz="4"/>
-              <w:bottom w:val="single" w:color="C8CDD6" w:sz="4"/>
-              <w:right w:val="single" w:color="C8CDD6" w:sz="4"/>
-            </w:tcBorders>
-            <w:tcMar>
-              <w:top w:type="dxa" w:w="60"/>
-              <w:left w:type="dxa" w:w="100"/>
-              <w:bottom w:type="dxa" w:w="60"/>
-              <w:right w:type="dxa" w:w="100"/>
-            </w:tcMar>
-          </w:tcPr>
-          <w:p>
-            <w:r>
-              <w:rPr>
-                <w:b w:val="false"/>
-                <w:bCs w:val="false"/>
-                <w:sz w:val="19"/>
-                <w:szCs w:val="19"/>
-              </w:rPr>
-              <w:t xml:space="preserve">Pantallas mínimas</w:t>
-            </w:r>
-          </w:p>
-        </w:tc>
-        <w:tc>
-          <w:tcPr>
-            <w:tcW w:type="dxa" w:w="3100"/>
-            <w:tcBorders>
-              <w:top w:val="single" w:color="C8CDD6" w:sz="4"/>
-              <w:left w:val="single" w:color="C8CDD6" w:sz="4"/>
-              <w:bottom w:val="single" w:color="C8CDD6" w:sz="4"/>
-              <w:right w:val="single" w:color="C8CDD6" w:sz="4"/>
-            </w:tcBorders>
-            <w:tcMar>
-              <w:top w:type="dxa" w:w="60"/>
-              <w:left w:type="dxa" w:w="100"/>
-              <w:bottom w:type="dxa" w:w="60"/>
-              <w:right w:type="dxa" w:w="100"/>
-            </w:tcMar>
-          </w:tcPr>
-          <w:p>
-            <w:r>
-              <w:rPr>
-                <w:b w:val="false"/>
-                <w:bCs w:val="false"/>
-                <w:sz w:val="19"/>
-                <w:szCs w:val="19"/>
-              </w:rPr>
-              <w:t xml:space="preserve">Inicio / estado party / batalla / resultados</w:t>
-            </w:r>
-          </w:p>
-        </w:tc>
-        <w:tc>
-          <w:tcPr>
-            <w:tcW w:type="dxa" w:w="3426"/>
-            <w:tcBorders>
-              <w:top w:val="single" w:color="C8CDD6" w:sz="4"/>
-              <w:left w:val="single" w:color="C8CDD6" w:sz="4"/>
-              <w:bottom w:val="single" w:color="C8CDD6" w:sz="4"/>
-              <w:right w:val="single" w:color="C8CDD6" w:sz="4"/>
-            </w:tcBorders>
-            <w:tcMar>
-              <w:top w:type="dxa" w:w="60"/>
-              <w:left w:type="dxa" w:w="100"/>
-              <w:bottom w:type="dxa" w:w="60"/>
-              <w:right w:type="dxa" w:w="100"/>
-            </w:tcMar>
-          </w:tcPr>
-          <w:p>
-            <w:r>
-              <w:rPr>
-                <w:b w:val="false"/>
-                <w:bCs w:val="false"/>
-                <w:sz w:val="19"/>
-                <w:szCs w:val="19"/>
-              </w:rPr>
-              <w:t xml:space="preserve">Menú / torre / batalla / inventario</w:t>
-            </w:r>
-          </w:p>
-        </w:tc>
-      </w:tr>
-      <w:tr>
-        <w:tc>
-          <w:tcPr>
-            <w:tcW w:type="dxa" w:w="2500"/>
-            <w:tcBorders>
-              <w:top w:val="single" w:color="C8CDD6" w:sz="4"/>
-              <w:left w:val="single" w:color="C8CDD6" w:sz="4"/>
-              <w:bottom w:val="single" w:color="C8CDD6" w:sz="4"/>
-              <w:right w:val="single" w:color="C8CDD6" w:sz="4"/>
-            </w:tcBorders>
-            <w:tcMar>
-              <w:top w:type="dxa" w:w="60"/>
-              <w:left w:type="dxa" w:w="100"/>
-              <w:bottom w:type="dxa" w:w="60"/>
-              <w:right w:type="dxa" w:w="100"/>
-            </w:tcMar>
-          </w:tcPr>
-          <w:p>
-            <w:r>
-              <w:rPr>
-                <w:b w:val="false"/>
-                <w:bCs w:val="false"/>
-                <w:sz w:val="19"/>
-                <w:szCs w:val="19"/>
-              </w:rPr>
-              <w:t xml:space="preserve">Experiencia por enemigo</w:t>
-            </w:r>
-          </w:p>
-        </w:tc>
-        <w:tc>
-          <w:tcPr>
-            <w:tcW w:type="dxa" w:w="3100"/>
-            <w:tcBorders>
-              <w:top w:val="single" w:color="C8CDD6" w:sz="4"/>
-              <w:left w:val="single" w:color="C8CDD6" w:sz="4"/>
-              <w:bottom w:val="single" w:color="C8CDD6" w:sz="4"/>
-              <w:right w:val="single" w:color="C8CDD6" w:sz="4"/>
-            </w:tcBorders>
-            <w:tcMar>
-              <w:top w:type="dxa" w:w="60"/>
-              <w:left w:type="dxa" w:w="100"/>
-              <w:bottom w:type="dxa" w:w="60"/>
-              <w:right w:type="dxa" w:w="100"/>
-            </w:tcMar>
-          </w:tcPr>
-          <w:p>
-            <w:r>
-              <w:rPr>
-                <w:b w:val="false"/>
-                <w:bCs w:val="false"/>
-                <w:sz w:val="19"/>
-                <w:szCs w:val="19"/>
-              </w:rPr>
-              <w:t xml:space="preserve">Dice "fija por tipo", sin números</w:t>
-            </w:r>
-          </w:p>
-        </w:tc>
-        <w:tc>
-          <w:tcPr>
-            <w:tcW w:type="dxa" w:w="3426"/>
-            <w:tcBorders>
-              <w:top w:val="single" w:color="C8CDD6" w:sz="4"/>
-              <w:left w:val="single" w:color="C8CDD6" w:sz="4"/>
-              <w:bottom w:val="single" w:color="C8CDD6" w:sz="4"/>
-              <w:right w:val="single" w:color="C8CDD6" w:sz="4"/>
-            </w:tcBorders>
-            <w:tcMar>
-              <w:top w:type="dxa" w:w="60"/>
-              <w:left w:type="dxa" w:w="100"/>
-              <w:bottom w:type="dxa" w:w="60"/>
-              <w:right w:type="dxa" w:w="100"/>
-            </w:tcMar>
-          </w:tcPr>
-          <w:p>
-            <w:r>
-              <w:rPr>
-                <w:b w:val="false"/>
-                <w:bCs w:val="false"/>
-                <w:sz w:val="19"/>
-                <w:szCs w:val="19"/>
-              </w:rPr>
-              <w:t xml:space="preserve">Propuesta: Slime 30, Goblin 50, Rey 250, Guardián 500</w:t>
+            <w:tcW w:type="dxa" w:w="2400"/>
+            <w:tcBorders>
+              <w:top w:val="single" w:color="C8CDD6" w:sz="4"/>
+              <w:left w:val="single" w:color="C8CDD6" w:sz="4"/>
+              <w:bottom w:val="single" w:color="C8CDD6" w:sz="4"/>
+              <w:right w:val="single" w:color="C8CDD6" w:sz="4"/>
+            </w:tcBorders>
+            <w:tcMar>
+              <w:top w:type="dxa" w:w="60"/>
+              <w:left w:type="dxa" w:w="100"/>
+              <w:bottom w:type="dxa" w:w="60"/>
+              <w:right w:type="dxa" w:w="100"/>
+            </w:tcMar>
+          </w:tcPr>
+          <w:p>
+            <w:r>
+              <w:rPr>
+                <w:b w:val="false"/>
+                <w:bCs w:val="false"/>
+                <w:sz w:val="19"/>
+                <w:szCs w:val="19"/>
+              </w:rPr>
+              <w:t xml:space="preserve">Escudo (mitad de daño, 2 turnos)</w:t>
+            </w:r>
+          </w:p>
+        </w:tc>
+        <w:tc>
+          <w:tcPr>
+            <w:tcW w:type="dxa" w:w="3500"/>
+            <w:tcBorders>
+              <w:top w:val="single" w:color="C8CDD6" w:sz="4"/>
+              <w:left w:val="single" w:color="C8CDD6" w:sz="4"/>
+              <w:bottom w:val="single" w:color="C8CDD6" w:sz="4"/>
+              <w:right w:val="single" w:color="C8CDD6" w:sz="4"/>
+            </w:tcBorders>
+            <w:tcMar>
+              <w:top w:type="dxa" w:w="60"/>
+              <w:left w:type="dxa" w:w="100"/>
+              <w:bottom w:type="dxa" w:w="60"/>
+              <w:right w:type="dxa" w:w="100"/>
+            </w:tcMar>
+          </w:tcPr>
+          <w:p>
+            <w:r>
+              <w:rPr>
+                <w:b w:val="false"/>
+                <w:bCs w:val="false"/>
+                <w:sz w:val="19"/>
+                <w:szCs w:val="19"/>
+              </w:rPr>
+              <w:t xml:space="preserve">No está implementado.</w:t>
+            </w:r>
+          </w:p>
+        </w:tc>
+        <w:tc>
+          <w:tcPr>
+            <w:tcW w:type="dxa" w:w="3126"/>
+            <w:tcBorders>
+              <w:top w:val="single" w:color="C8CDD6" w:sz="4"/>
+              <w:left w:val="single" w:color="C8CDD6" w:sz="4"/>
+              <w:bottom w:val="single" w:color="C8CDD6" w:sz="4"/>
+              <w:right w:val="single" w:color="C8CDD6" w:sz="4"/>
+            </w:tcBorders>
+            <w:tcMar>
+              <w:top w:type="dxa" w:w="60"/>
+              <w:left w:type="dxa" w:w="100"/>
+              <w:bottom w:type="dxa" w:w="60"/>
+              <w:right w:type="dxa" w:w="100"/>
+            </w:tcMar>
+          </w:tcPr>
+          <w:p>
+            <w:r>
+              <w:rPr>
+                <w:b w:val="false"/>
+                <w:bCs w:val="false"/>
+                <w:sz w:val="19"/>
+                <w:szCs w:val="19"/>
+              </w:rPr>
+              <w:t xml:space="preserve">El documento lo nombra pero no dice quién lo da.</w:t>
             </w:r>
           </w:p>
         </w:tc>
@@ -3785,7 +4878,7 @@
         <w:spacing w:after="120" w:before="120"/>
       </w:pPr>
       <w:r>
-        <w:t xml:space="preserve">Para facilitar eso dejé </w:t>
+        <w:t xml:space="preserve">El diagrama de clases del código actual está en </w:t>
       </w:r>
       <w:r>
         <w:rPr>
@@ -3796,7 +4889,7 @@
         <w:t xml:space="preserve">docs/diagrama-clases.mmd</w:t>
       </w:r>
       <w:r>
-        <w:t xml:space="preserve">: el diagrama de clases del código actual en Mermaid (se pega en el mismo mermaid.ai que usamos en la entrega).</w:t>
+        <w:t xml:space="preserve"> (se pega en el mismo mermaid.ai de la entrega) para actualizar el oficial.</w:t>
       </w:r>
     </w:p>
     <w:p>
@@ -3804,7 +4897,7 @@
         <w:pStyle w:val="Heading1"/>
       </w:pPr>
       <w:r>
-        <w:t xml:space="preserve">9. Próximos 3 pasos</w:t>
+        <w:t xml:space="preserve">10. Próximos 3 pasos</w:t>
       </w:r>
     </w:p>
     <w:p>
@@ -3821,10 +4914,10 @@
           <w:b/>
           <w:bCs/>
         </w:rPr>
-        <w:t xml:space="preserve">Partida + Torre. </w:t>
-      </w:r>
-      <w:r>
-        <w:t xml:space="preserve">Una clase que guarde la party y el piso alcanzado. Se sube de a un piso, la party no se reinicia entre pisos (hoy cada batalla arranca con una party nueva de nivel 1), game over vuelve al menú y ganar el piso 10 termina el juego. Es lo que hace que la experiencia y los niveles empiecen a importar.</w:t>
+        <w:t xml:space="preserve">Ítems e Inventario. </w:t>
+      </w:r>
+      <w:r>
+        <w:t xml:space="preserve">Item (abstracta) → Consumible / Equipable, Inventario de 6 espacios, los 4 consumibles y los 8 equipables, la acción "Usar ítem" en la batalla y las recompensas al ganar. Es requisito explícito de la cátedra y le da contenido real a la pantalla de Inventario.</w:t>
       </w:r>
     </w:p>
     <w:p>
@@ -3841,10 +4934,10 @@
           <w:b/>
           <w:bCs/>
         </w:rPr>
-        <w:t xml:space="preserve">Ítems e Inventario. </w:t>
-      </w:r>
-      <w:r>
-        <w:t xml:space="preserve">Item (abstracta) → Consumible / Equipable, Inventario de 6 espacios, los 4 consumibles y los 8 equipables. Acción "Usar ítem" en la batalla y recompensas por lista ponderada al ganar. Es requisito explícito de la cátedra.</w:t>
+        <w:t xml:space="preserve">Guardar y cargar partida. </w:t>
+      </w:r>
+      <w:r>
+        <w:t xml:space="preserve">Archivo con el piso, la party y el inventario (como dice el documento), el botón "Guardar" del Resumen y la lista real en Partidas guardadas.</w:t>
       </w:r>
     </w:p>
     <w:p>
@@ -3861,18 +4954,10 @@
           <w:b/>
           <w:bCs/>
         </w:rPr>
-        <w:t xml:space="preserve">Alinear documento y diagramas. </w:t>
-      </w:r>
-      <w:r>
-        <w:t xml:space="preserve">Decidir las diferencias de la sección 8 y actualizar el diagrama de clases y los de secuencia. Conviene hacerlo antes de que el código crezca más.</w:t>
-      </w:r>
-    </w:p>
-    <w:p>
-      <w:pPr>
-        <w:spacing w:before="120"/>
-      </w:pPr>
-      <w:r>
-        <w:t xml:space="preserve">Después vienen guardar/cargar partida, la pantalla de resultados/estado de la party, el Escudo y los especiales de los jefes. Todo está en el checklist-tpo.txt (lo condensé: ahora es una lista corta de hecho/falta).</w:t>
+        <w:t xml:space="preserve">Cerrar las decisiones de la sección 9 y actualizar los diagramas. </w:t>
+      </w:r>
+      <w:r>
+        <w:t xml:space="preserve">Sobre todo el balance y la vida entre pisos, y pasar el diagrama de clases y los de secuencia a lo que hay hoy en el código.</w:t>
       </w:r>
     </w:p>
     <w:sectPr>

</xml_diff>